<commit_message>
Upgrade /research-plan to an MBB research-expert standard
Adds: research brief, locked definitions, research questions mapped to the
issue tree with a MECE check, impact/gap/reach ranking, sources beyond the
web (databases, firm knowledge, expert network) with reach marked, a method
per question (two independent routes) with a triangulation table,
questions the web cannot answer, a compliance check (listed companies,
MNPI, expert network rules), and a midpoint check-in with the EM.

Gemini and Copilot packs and the skills bundle rebuilt.

Co-Authored-By: Claude Sonnet 5.5 <noreply@anthropic.com>
Claude-Session: https://claude.ai/code/session_0149gFGtX71BJ8vYS7aurFi6
</commit_message>
<xml_diff>
--- a/copilot/knowledge-pack/CORE-2_Playbooks-Mobilize-to-Diagnose.docx
+++ b/copilot/knowledge-pack/CORE-2_Playbooks-Mobilize-to-Diagnose.docx
@@ -2,7 +2,7 @@
 <file path=word/document.xml><?xml version="1.0" encoding="utf-8"?>
 <w:document xmlns:w="http://schemas.openxmlformats.org/wordprocessingml/2006/main" xmlns:m="http://schemas.openxmlformats.org/officeDocument/2006/math" xmlns:r="http://schemas.openxmlformats.org/officeDocument/2006/relationships" xmlns:o="urn:schemas-microsoft-com:office:office" xmlns:v="urn:schemas-microsoft-com:vml" xmlns:w10="urn:schemas-microsoft-com:office:word" xmlns:a="http://schemas.openxmlformats.org/drawingml/2006/main" xmlns:pic="http://schemas.openxmlformats.org/drawingml/2006/picture" xmlns:wp="http://schemas.openxmlformats.org/drawingml/2006/wordprocessingDrawing">
   <w:body>
-    <w:bookmarkStart w:id="380" w:name="X1ffb69cf8f8af76df69c6ba4783bf0dfb01ba76"/>
+    <w:bookmarkStart w:id="381" w:name="X1ffb69cf8f8af76df69c6ba4783bf0dfb01ba76"/>
     <w:p>
       <w:pPr>
         <w:pStyle w:val="Heading1"/>
@@ -8772,7 +8772,7 @@
       </w:r>
     </w:p>
     <w:bookmarkEnd w:id="142"/>
-    <w:bookmarkStart w:id="158" w:name="X4cecf8998fd38c74c1fa59425a14c52354f68bd"/>
+    <w:bookmarkStart w:id="159" w:name="X4cecf8998fd38c74c1fa59425a14c52354f68bd"/>
     <w:p>
       <w:pPr>
         <w:pStyle w:val="Heading2"/>
@@ -8852,6 +8852,9 @@
         <w:t xml:space="preserve">The decision or slide it feeds</w:t>
       </w:r>
       <w:r>
+        <w:t xml:space="preserve">, who will use the findings, in what format, and by when</w:t>
+      </w:r>
+      <w:r>
         <w:t xml:space="preserve"> </w:t>
       </w:r>
       <w:r>
@@ -8870,13 +8873,35 @@
       <w:r>
         <w:t xml:space="preserve">: quick (about 10 searches), standard (about 25), or deep (50 or more)</w:t>
       </w:r>
+      <w:r>
+        <w:t xml:space="preserve"> </w:t>
+      </w:r>
+      <w:r>
+        <w:t xml:space="preserve">4.</w:t>
+      </w:r>
+      <w:r>
+        <w:t xml:space="preserve"> </w:t>
+      </w:r>
+      <w:r>
+        <w:rPr>
+          <w:bCs/>
+          <w:b/>
+        </w:rPr>
+        <w:t xml:space="preserve">Which paid sources and experts the team can reach</w:t>
+      </w:r>
+      <w:r>
+        <w:t xml:space="preserve"> </w:t>
+      </w:r>
+      <w:r>
+        <w:t xml:space="preserve">(databases, expert network, firm knowledge base)</w:t>
+      </w:r>
     </w:p>
     <w:p>
       <w:pPr>
         <w:pStyle w:val="BodyText"/>
       </w:pPr>
       <w:r>
-        <w:t xml:space="preserve">I will turn the question into a short list of research questions, map the best sources for each, and show you the plan before I search. After you approve it, I run the searches, log every source with a grade, and write a synthesis that says what moved and what is still open.</w:t>
+        <w:t xml:space="preserve">I will write a one-page research brief, lock the definitions, build MECE research questions from the issue tree, rank them by impact, and plan the sources and method for each one, including the questions the open web cannot answer. You approve the plan before I search. After that I run the research, check in with you at the halfway point, log every source with a grade, triangulate the numbers that matter, and write a synthesis that says what moved and what is still open.</w:t>
       </w:r>
     </w:p>
     <w:p>
@@ -8950,7 +8975,7 @@
       </w:r>
     </w:p>
     <w:bookmarkEnd w:id="143"/>
-    <w:bookmarkStart w:id="147" w:name="step-1-diagnostic-questions-7"/>
+    <w:bookmarkStart w:id="148" w:name="step-1-diagnostic-questions-7"/>
     <w:p>
       <w:pPr>
         <w:pStyle w:val="Heading3"/>
@@ -8959,13 +8984,13 @@
         <w:t xml:space="preserve">Step 1: Diagnostic Questions</w:t>
       </w:r>
     </w:p>
-    <w:bookmarkStart w:id="144" w:name="question-1-the-decision-2"/>
+    <w:bookmarkStart w:id="144" w:name="question-1-the-decision-and-the-user"/>
     <w:p>
       <w:pPr>
         <w:pStyle w:val="Heading4"/>
       </w:pPr>
       <w:r>
-        <w:t xml:space="preserve">Question 1: The decision</w:t>
+        <w:t xml:space="preserve">Question 1: The decision and the user</w:t>
       </w:r>
     </w:p>
     <w:p>
@@ -8977,7 +9002,7 @@
           <w:bCs/>
           <w:b/>
         </w:rPr>
-        <w:t xml:space="preserve">"What decision or slide does this research feed, and what would change your mind?"</w:t>
+        <w:t xml:space="preserve">"What decision or slide does this research feed, who uses it, in what format, by when, and what would change your mind?"</w:t>
       </w:r>
     </w:p>
     <w:p>
@@ -8985,7 +9010,7 @@
         <w:pStyle w:val="BodyText"/>
       </w:pPr>
       <w:r>
-        <w:t xml:space="preserve">Research with no decision behind it becomes a reading list. Name the hypothesis and the result that would weaken it.</w:t>
+        <w:t xml:space="preserve">Research with no decision behind it becomes a reading list. Name the hypothesis, the result that would weaken it, the person who will use the findings (partner, EM, client team), and the format they want (one page, fact pack, backup slides).</w:t>
       </w:r>
     </w:p>
     <w:bookmarkEnd w:id="144"/>
@@ -9019,13 +9044,43 @@
       </w:r>
     </w:p>
     <w:bookmarkEnd w:id="145"/>
-    <w:bookmarkStart w:id="146" w:name="question-3-depth-and-stop-rule"/>
+    <w:bookmarkStart w:id="146" w:name="question-3-access"/>
     <w:p>
       <w:pPr>
         <w:pStyle w:val="Heading4"/>
       </w:pPr>
       <w:r>
-        <w:t xml:space="preserve">Question 3: Depth and stop rule</w:t>
+        <w:t xml:space="preserve">Question 3: Access</w:t>
+      </w:r>
+    </w:p>
+    <w:p>
+      <w:pPr>
+        <w:pStyle w:val="FirstParagraph"/>
+      </w:pPr>
+      <w:r>
+        <w:rPr>
+          <w:bCs/>
+          <w:b/>
+        </w:rPr>
+        <w:t xml:space="preserve">"Which paid databases, expert networks, and firm knowledge sources can the team use on this engagement?"</w:t>
+      </w:r>
+    </w:p>
+    <w:p>
+      <w:pPr>
+        <w:pStyle w:val="BodyText"/>
+      </w:pPr>
+      <w:r>
+        <w:t xml:space="preserve">List what the team holds (for example Capital IQ, Bloomberg, Factiva, Gartner, Forrester, Euromonitor, Statista, PitchBook, GLG, AlphaSights, the firm's own knowledge base). I plan only on what you confirm. For anything we lack, I flag it in the plan so you can request access early.</w:t>
+      </w:r>
+    </w:p>
+    <w:bookmarkEnd w:id="146"/>
+    <w:bookmarkStart w:id="147" w:name="question-4-depth-and-stop-rule"/>
+    <w:p>
+      <w:pPr>
+        <w:pStyle w:val="Heading4"/>
+      </w:pPr>
+      <w:r>
+        <w:t xml:space="preserve">Question 4: Depth and stop rule</w:t>
       </w:r>
     </w:p>
     <w:p>
@@ -9055,9 +9110,9 @@
         </w:pict>
       </w:r>
     </w:p>
-    <w:bookmarkEnd w:id="146"/>
     <w:bookmarkEnd w:id="147"/>
-    <w:bookmarkStart w:id="151" w:name="the-process-7"/>
+    <w:bookmarkEnd w:id="148"/>
+    <w:bookmarkStart w:id="152" w:name="the-process-7"/>
     <w:p>
       <w:pPr>
         <w:pStyle w:val="Heading3"/>
@@ -9066,7 +9121,7 @@
         <w:t xml:space="preserve">The Process</w:t>
       </w:r>
     </w:p>
-    <w:bookmarkStart w:id="148" w:name="X840d70314788bce4bfc7d997330ac3f31ede56c"/>
+    <w:bookmarkStart w:id="149" w:name="X840d70314788bce4bfc7d997330ac3f31ede56c"/>
     <w:p>
       <w:pPr>
         <w:pStyle w:val="Heading4"/>
@@ -9084,13 +9139,13 @@
           <w:bCs/>
           <w:b/>
         </w:rPr>
-        <w:t xml:space="preserve">1. Turn the question into research questions.</w:t>
-      </w:r>
-      <w:r>
-        <w:t xml:space="preserve"> </w:t>
-      </w:r>
-      <w:r>
-        <w:t xml:space="preserve">Five to seven at most. Each one is specific and answerable: "What share of [segment] bookings went through [channel] in the last two full years?" beats "Understand the channel landscape." For each, write the hypothesis it tests and the result that would weaken it.</w:t>
+        <w:t xml:space="preserve">1. Write the research brief.</w:t>
+      </w:r>
+      <w:r>
+        <w:t xml:space="preserve"> </w:t>
+      </w:r>
+      <w:r>
+        <w:t xml:space="preserve">Five lines: the decision this feeds, the user of the findings, the format they want, the due date, and the depth. Add the midpoint check-in (see Phase B, step 15) and name who gets it.</w:t>
       </w:r>
     </w:p>
     <w:p>
@@ -9102,13 +9157,61 @@
           <w:bCs/>
           <w:b/>
         </w:rPr>
-        <w:t xml:space="preserve">2. Map the sources.</w:t>
-      </w:r>
-      <w:r>
-        <w:t xml:space="preserve"> </w:t>
-      </w:r>
-      <w:r>
-        <w:t xml:space="preserve">For each research question, list the best source types in order, and why:</w:t>
+        <w:t xml:space="preserve">2. Lock the definitions.</w:t>
+      </w:r>
+      <w:r>
+        <w:t xml:space="preserve"> </w:t>
+      </w:r>
+      <w:r>
+        <w:t xml:space="preserve">Before any question, write a definitions table: each key term (for example "market", "booking", "active customer"), its scope, period, geography, and unit. Most conflicting numbers come from two definitions of one word. If a definition is the client's to set, ask the sponsor or EM to confirm it. Log the agreed definitions with the decision-doc playbook.</w:t>
+      </w:r>
+    </w:p>
+    <w:p>
+      <w:pPr>
+        <w:pStyle w:val="BodyText"/>
+      </w:pPr>
+      <w:r>
+        <w:rPr>
+          <w:bCs/>
+          <w:b/>
+        </w:rPr>
+        <w:t xml:space="preserve">3. Build the research questions from the issue tree.</w:t>
+      </w:r>
+      <w:r>
+        <w:t xml:space="preserve"> </w:t>
+      </w:r>
+      <w:r>
+        <w:t xml:space="preserve">Take the branch this research serves from</w:t>
+      </w:r>
+      <w:r>
+        <w:t xml:space="preserve"> </w:t>
+      </w:r>
+      <w:r>
+        <w:rPr>
+          <w:rStyle w:val="VerbatimChar"/>
+        </w:rPr>
+        <w:t xml:space="preserve">Client folder 01_Outputs/issue-trees/</w:t>
+      </w:r>
+      <w:r>
+        <w:t xml:space="preserve">. Write one research question for each leaf that needs outside evidence. Then run the MECE check against the parent branch: no two questions answer the same thing, and together they cover the branch. Show any leaf you left out and why (client data answers it, or it is out of scope). If no issue tree exists for this branch, run the issue-tree playbook first, or sketch a one-level tree and mark it as a draft. Each question names the hypothesis it tests and the result that would weaken it. Phrase it so it can be answered: "What share of [segment] bookings went through [channel] in the last two full years?" beats "Understand the channel landscape."</w:t>
+      </w:r>
+    </w:p>
+    <w:p>
+      <w:pPr>
+        <w:pStyle w:val="BodyText"/>
+      </w:pPr>
+      <w:r>
+        <w:rPr>
+          <w:bCs/>
+          <w:b/>
+        </w:rPr>
+        <w:t xml:space="preserve">4. Rank and cut.</w:t>
+      </w:r>
+      <w:r>
+        <w:t xml:space="preserve"> </w:t>
+      </w:r>
+      <w:r>
+        <w:t xml:space="preserve">Score every question on three things, High, Medium, or Low:</w:t>
       </w:r>
       <w:r>
         <w:t xml:space="preserve"> </w:t>
@@ -9124,13 +9227,13 @@
           <w:bCs/>
           <w:b/>
         </w:rPr>
-        <w:t xml:space="preserve">Grade A, primary:</w:t>
-      </w:r>
-      <w:r>
-        <w:t xml:space="preserve"> </w:t>
-      </w:r>
-      <w:r>
-        <w:t xml:space="preserve">regulator filings, annual reports and 10-Ks, statistical agencies, company investor decks, court records, standards bodies, official price lists</w:t>
+        <w:t xml:space="preserve">Impact on the answer:</w:t>
+      </w:r>
+      <w:r>
+        <w:t xml:space="preserve"> </w:t>
+      </w:r>
+      <w:r>
+        <w:t xml:space="preserve">would the result change the recommendation or a number on a page?</w:t>
       </w:r>
       <w:r>
         <w:t xml:space="preserve"> </w:t>
@@ -9146,13 +9249,13 @@
           <w:bCs/>
           <w:b/>
         </w:rPr>
-        <w:t xml:space="preserve">Grade B, reputable secondary:</w:t>
-      </w:r>
-      <w:r>
-        <w:t xml:space="preserve"> </w:t>
-      </w:r>
-      <w:r>
-        <w:t xml:space="preserve">industry associations, major business press, peer-reviewed research, analyst summaries with stated method</w:t>
+        <w:t xml:space="preserve">Evidence gap:</w:t>
+      </w:r>
+      <w:r>
+        <w:t xml:space="preserve"> </w:t>
+      </w:r>
+      <w:r>
+        <w:t xml:space="preserve">how little do we already know?</w:t>
       </w:r>
       <w:r>
         <w:t xml:space="preserve"> </w:t>
@@ -9168,13 +9271,13 @@
           <w:bCs/>
           <w:b/>
         </w:rPr>
-        <w:t xml:space="preserve">Grade C, weak:</w:t>
-      </w:r>
-      <w:r>
-        <w:t xml:space="preserve"> </w:t>
-      </w:r>
-      <w:r>
-        <w:t xml:space="preserve">vendor blogs, press releases without data, unsourced listicles, opinion, forums. Use only to find a lead, never as the proof of a number.</w:t>
+        <w:t xml:space="preserve">Reach:</w:t>
+      </w:r>
+      <w:r>
+        <w:t xml:space="preserve"> </w:t>
+      </w:r>
+      <w:r>
+        <w:t xml:space="preserve">can we get a reliable answer in the time box with the sources we can access?</w:t>
       </w:r>
     </w:p>
     <w:p>
@@ -9182,17 +9285,7 @@
         <w:pStyle w:val="BodyText"/>
       </w:pPr>
       <w:r>
-        <w:rPr>
-          <w:bCs/>
-          <w:b/>
-        </w:rPr>
-        <w:t xml:space="preserve">3. Draft the search plan.</w:t>
-      </w:r>
-      <w:r>
-        <w:t xml:space="preserve"> </w:t>
-      </w:r>
-      <w:r>
-        <w:t xml:space="preserve">For each question: three to five queries, the sites or publishers to favor, and the date window. Prefer primary sources and add the year to queries about current facts.</w:t>
+        <w:t xml:space="preserve">Run the High-impact, High-gap questions first. Park or kill Low-impact ones. Keep the plan to five to seven questions. If you have more, use the prioritize-analyses playbook. Show the ranking and what you cut.</w:t>
       </w:r>
     </w:p>
     <w:p>
@@ -9204,13 +9297,91 @@
           <w:bCs/>
           <w:b/>
         </w:rPr>
-        <w:t xml:space="preserve">4. Set the budget.</w:t>
-      </w:r>
-      <w:r>
-        <w:t xml:space="preserve"> </w:t>
-      </w:r>
-      <w:r>
-        <w:t xml:space="preserve">Searches and page fetches allowed, time box, and the stop rule.</w:t>
+        <w:t xml:space="preserve">5. Plan the sources beyond the open web.</w:t>
+      </w:r>
+      <w:r>
+        <w:t xml:space="preserve"> </w:t>
+      </w:r>
+      <w:r>
+        <w:t xml:space="preserve">For each question, list sources in this order and mark reach as</w:t>
+      </w:r>
+      <w:r>
+        <w:t xml:space="preserve"> </w:t>
+      </w:r>
+      <w:r>
+        <w:rPr>
+          <w:bCs/>
+          <w:b/>
+        </w:rPr>
+        <w:t xml:space="preserve">have</w:t>
+      </w:r>
+      <w:r>
+        <w:t xml:space="preserve">,</w:t>
+      </w:r>
+      <w:r>
+        <w:t xml:space="preserve"> </w:t>
+      </w:r>
+      <w:r>
+        <w:rPr>
+          <w:bCs/>
+          <w:b/>
+        </w:rPr>
+        <w:t xml:space="preserve">ask</w:t>
+      </w:r>
+      <w:r>
+        <w:t xml:space="preserve"> </w:t>
+      </w:r>
+      <w:r>
+        <w:t xml:space="preserve">(request access), or</w:t>
+      </w:r>
+      <w:r>
+        <w:t xml:space="preserve"> </w:t>
+      </w:r>
+      <w:r>
+        <w:rPr>
+          <w:bCs/>
+          <w:b/>
+        </w:rPr>
+        <w:t xml:space="preserve">no</w:t>
+      </w:r>
+      <w:r>
+        <w:t xml:space="preserve">:</w:t>
+      </w:r>
+      <w:r>
+        <w:t xml:space="preserve"> </w:t>
+      </w:r>
+      <w:r>
+        <w:t xml:space="preserve">1. Client data and the ingest digests (what they already told us)</w:t>
+      </w:r>
+      <w:r>
+        <w:t xml:space="preserve"> </w:t>
+      </w:r>
+      <w:r>
+        <w:t xml:space="preserve">2. Firm knowledge base, prior engagements, and benchmarks (strip client identifiers)</w:t>
+      </w:r>
+      <w:r>
+        <w:t xml:space="preserve"> </w:t>
+      </w:r>
+      <w:r>
+        <w:t xml:space="preserve">3. Licensed databases and research firms (confirmed in Question 3)</w:t>
+      </w:r>
+      <w:r>
+        <w:t xml:space="preserve"> </w:t>
+      </w:r>
+      <w:r>
+        <w:t xml:space="preserve">4. Public primary sources: regulator filings, annual reports and 10-Ks, statistical agencies, investor decks, standards bodies, official price lists</w:t>
+      </w:r>
+      <w:r>
+        <w:t xml:space="preserve"> </w:t>
+      </w:r>
+      <w:r>
+        <w:t xml:space="preserve">5. Reputable secondary sources: industry associations, major business press, peer-reviewed research, analyst summaries with a stated method</w:t>
+      </w:r>
+      <w:r>
+        <w:t xml:space="preserve"> </w:t>
+      </w:r>
+      <w:r>
+        <w:t xml:space="preserve">6. Experts and customers: expert network calls, client interviews (the interview-guide playbook)</w:t>
       </w:r>
     </w:p>
     <w:p>
@@ -9218,17 +9389,55 @@
         <w:pStyle w:val="BodyText"/>
       </w:pPr>
       <w:r>
-        <w:rPr>
-          <w:bCs/>
-          <w:b/>
-        </w:rPr>
-        <w:t xml:space="preserve">5. Run the confidentiality check.</w:t>
-      </w:r>
-      <w:r>
-        <w:t xml:space="preserve"> </w:t>
-      </w:r>
-      <w:r>
-        <w:t xml:space="preserve">Read every draft query. Remove client identifiers. If web tools are not approved for this engagement, stop and say so.</w:t>
+        <w:t xml:space="preserve">Source grades:</w:t>
+      </w:r>
+      <w:r>
+        <w:t xml:space="preserve"> </w:t>
+      </w:r>
+      <w:r>
+        <w:rPr>
+          <w:bCs/>
+          <w:b/>
+        </w:rPr>
+        <w:t xml:space="preserve">A</w:t>
+      </w:r>
+      <w:r>
+        <w:t xml:space="preserve"> </w:t>
+      </w:r>
+      <w:r>
+        <w:t xml:space="preserve">primary,</w:t>
+      </w:r>
+      <w:r>
+        <w:t xml:space="preserve"> </w:t>
+      </w:r>
+      <w:r>
+        <w:rPr>
+          <w:bCs/>
+          <w:b/>
+        </w:rPr>
+        <w:t xml:space="preserve">B</w:t>
+      </w:r>
+      <w:r>
+        <w:t xml:space="preserve"> </w:t>
+      </w:r>
+      <w:r>
+        <w:t xml:space="preserve">reputable secondary,</w:t>
+      </w:r>
+      <w:r>
+        <w:t xml:space="preserve"> </w:t>
+      </w:r>
+      <w:r>
+        <w:rPr>
+          <w:bCs/>
+          <w:b/>
+        </w:rPr>
+        <w:t xml:space="preserve">C</w:t>
+      </w:r>
+      <w:r>
+        <w:t xml:space="preserve"> </w:t>
+      </w:r>
+      <w:r>
+        <w:t xml:space="preserve">weak (vendor blogs, press releases without data, unsourced lists, opinion, forums; a lead, never the proof of a number).</w:t>
       </w:r>
     </w:p>
     <w:p>
@@ -9236,21 +9445,187 @@
         <w:pStyle w:val="BodyText"/>
       </w:pPr>
       <w:r>
-        <w:rPr>
-          <w:bCs/>
-          <w:b/>
-        </w:rPr>
-        <w:t xml:space="preserve">6. Show the plan</w:t>
-      </w:r>
-      <w:r>
-        <w:t xml:space="preserve"> </w:t>
-      </w:r>
-      <w:r>
-        <w:t xml:space="preserve">as the table below and ask for approval or edits before running anything.</w:t>
-      </w:r>
-    </w:p>
-    <w:bookmarkEnd w:id="148"/>
-    <w:bookmarkStart w:id="149" w:name="phase-b-run"/>
+        <w:t xml:space="preserve">Then list the questions the open web cannot answer on its own (paywalled data, proprietary prices, internal client figures, expert judgment). For each, say what we need and request it now: database access, an expert call, or a the data-request playbook. Do not leave these to the end.</w:t>
+      </w:r>
+    </w:p>
+    <w:p>
+      <w:pPr>
+        <w:pStyle w:val="BodyText"/>
+      </w:pPr>
+      <w:r>
+        <w:rPr>
+          <w:bCs/>
+          <w:b/>
+        </w:rPr>
+        <w:t xml:space="preserve">6. Choose the method for each question.</w:t>
+      </w:r>
+      <w:r>
+        <w:t xml:space="preserve"> </w:t>
+      </w:r>
+      <w:r>
+        <w:t xml:space="preserve">For any number we will size or estimate, plan two independent routes:</w:t>
+      </w:r>
+      <w:r>
+        <w:t xml:space="preserve"> </w:t>
+      </w:r>
+      <w:r>
+        <w:t xml:space="preserve">-</w:t>
+      </w:r>
+      <w:r>
+        <w:t xml:space="preserve"> </w:t>
+      </w:r>
+      <w:r>
+        <w:rPr>
+          <w:bCs/>
+          <w:b/>
+        </w:rPr>
+        <w:t xml:space="preserve">Top-down and bottom-up:</w:t>
+      </w:r>
+      <w:r>
+        <w:t xml:space="preserve"> </w:t>
+      </w:r>
+      <w:r>
+        <w:t xml:space="preserve">for example total market times share, against units times price</w:t>
+      </w:r>
+      <w:r>
+        <w:t xml:space="preserve"> </w:t>
+      </w:r>
+      <w:r>
+        <w:t xml:space="preserve">-</w:t>
+      </w:r>
+      <w:r>
+        <w:t xml:space="preserve"> </w:t>
+      </w:r>
+      <w:r>
+        <w:rPr>
+          <w:bCs/>
+          <w:b/>
+        </w:rPr>
+        <w:t xml:space="preserve">Analog:</w:t>
+      </w:r>
+      <w:r>
+        <w:t xml:space="preserve"> </w:t>
+      </w:r>
+      <w:r>
+        <w:t xml:space="preserve">a comparable market, company, or geography, with the adjustment stated</w:t>
+      </w:r>
+      <w:r>
+        <w:t xml:space="preserve"> </w:t>
+      </w:r>
+      <w:r>
+        <w:t xml:space="preserve">-</w:t>
+      </w:r>
+      <w:r>
+        <w:t xml:space="preserve"> </w:t>
+      </w:r>
+      <w:r>
+        <w:rPr>
+          <w:bCs/>
+          <w:b/>
+        </w:rPr>
+        <w:t xml:space="preserve">Source against expert:</w:t>
+      </w:r>
+      <w:r>
+        <w:t xml:space="preserve"> </w:t>
+      </w:r>
+      <w:r>
+        <w:t xml:space="preserve">a filing or dataset checked against an expert's view</w:t>
+      </w:r>
+    </w:p>
+    <w:p>
+      <w:pPr>
+        <w:pStyle w:val="BodyText"/>
+      </w:pPr>
+      <w:r>
+        <w:t xml:space="preserve">Say which two routes you will use. A fact that exists in one authoritative source (a filed revenue figure, a published rate) needs the source and its date, not a second method.</w:t>
+      </w:r>
+    </w:p>
+    <w:p>
+      <w:pPr>
+        <w:pStyle w:val="BodyText"/>
+      </w:pPr>
+      <w:r>
+        <w:rPr>
+          <w:bCs/>
+          <w:b/>
+        </w:rPr>
+        <w:t xml:space="preserve">7. Draft the search plan.</w:t>
+      </w:r>
+      <w:r>
+        <w:t xml:space="preserve"> </w:t>
+      </w:r>
+      <w:r>
+        <w:t xml:space="preserve">For each web question: three to five queries, the sites or publishers to favor, and the date window. Add the year to queries about current facts.</w:t>
+      </w:r>
+    </w:p>
+    <w:p>
+      <w:pPr>
+        <w:pStyle w:val="BodyText"/>
+      </w:pPr>
+      <w:r>
+        <w:rPr>
+          <w:bCs/>
+          <w:b/>
+        </w:rPr>
+        <w:t xml:space="preserve">8. Set the budget.</w:t>
+      </w:r>
+      <w:r>
+        <w:t xml:space="preserve"> </w:t>
+      </w:r>
+      <w:r>
+        <w:t xml:space="preserve">Searches and page fetches allowed, expert calls allowed, the time box, and the stop rule.</w:t>
+      </w:r>
+    </w:p>
+    <w:p>
+      <w:pPr>
+        <w:pStyle w:val="BodyText"/>
+      </w:pPr>
+      <w:r>
+        <w:rPr>
+          <w:bCs/>
+          <w:b/>
+        </w:rPr>
+        <w:t xml:space="preserve">9. Run the confidentiality and compliance check.</w:t>
+      </w:r>
+      <w:r>
+        <w:t xml:space="preserve"> </w:t>
+      </w:r>
+      <w:r>
+        <w:t xml:space="preserve">- Read every draft query. Remove client identifiers, code names, internal figures, and interviewee names. If web tools are not approved for this engagement, stop and say so.</w:t>
+      </w:r>
+      <w:r>
+        <w:t xml:space="preserve"> </w:t>
+      </w:r>
+      <w:r>
+        <w:t xml:space="preserve">- If the client or any company we research is publicly listed, take no material non-public information from experts, insiders, or leaked documents, and stop the research if you receive some. Follow the firm's policy and ask compliance when unsure. I do not give legal advice.</w:t>
+      </w:r>
+      <w:r>
+        <w:t xml:space="preserve"> </w:t>
+      </w:r>
+      <w:r>
+        <w:t xml:space="preserve">- Before booking an expert call, confirm the firm's expert network rules: no current employees of the client or a competitor on topics that touch confidential information, the required call script, and compliance approval where the policy asks for it.</w:t>
+      </w:r>
+    </w:p>
+    <w:p>
+      <w:pPr>
+        <w:pStyle w:val="BodyText"/>
+      </w:pPr>
+      <w:r>
+        <w:rPr>
+          <w:bCs/>
+          <w:b/>
+        </w:rPr>
+        <w:t xml:space="preserve">10. Show the plan</w:t>
+      </w:r>
+      <w:r>
+        <w:t xml:space="preserve"> </w:t>
+      </w:r>
+      <w:r>
+        <w:t xml:space="preserve">in the template below and ask for approval or edits before running anything.</w:t>
+      </w:r>
+    </w:p>
+    <w:bookmarkEnd w:id="149"/>
+    <w:bookmarkStart w:id="150" w:name="phase-b-run"/>
     <w:p>
       <w:pPr>
         <w:pStyle w:val="Heading4"/>
@@ -9268,7 +9643,7 @@
           <w:bCs/>
           <w:b/>
         </w:rPr>
-        <w:t xml:space="preserve">7. Search in batches by research question.</w:t>
+        <w:t xml:space="preserve">11. Search in batches by research question.</w:t>
       </w:r>
       <w:r>
         <w:t xml:space="preserve"> </w:t>
@@ -9286,13 +9661,13 @@
           <w:bCs/>
           <w:b/>
         </w:rPr>
-        <w:t xml:space="preserve">8. Log every source you use</w:t>
-      </w:r>
-      <w:r>
-        <w:t xml:space="preserve"> </w:t>
-      </w:r>
-      <w:r>
-        <w:t xml:space="preserve">in the source log: ID (S1, S2), URL, publisher, author or body, publication date, date accessed, source type, and grade (A, B, C).</w:t>
+        <w:t xml:space="preserve">12. Log every source you use</w:t>
+      </w:r>
+      <w:r>
+        <w:t xml:space="preserve"> </w:t>
+      </w:r>
+      <w:r>
+        <w:t xml:space="preserve">in the source log: ID (S1, S2), URL or reference, publisher, author or body, publication date, date accessed, source type, and grade (A, B, C).</w:t>
       </w:r>
     </w:p>
     <w:p>
@@ -9304,13 +9679,13 @@
           <w:bCs/>
           <w:b/>
         </w:rPr>
-        <w:t xml:space="preserve">9. Record each finding as a claim.</w:t>
-      </w:r>
-      <w:r>
-        <w:t xml:space="preserve"> </w:t>
-      </w:r>
-      <w:r>
-        <w:t xml:space="preserve">One line each: the claim, the number with unit and period, the source ID and location (section, table, page), and a status:</w:t>
+        <w:t xml:space="preserve">13. Record each finding as a claim.</w:t>
+      </w:r>
+      <w:r>
+        <w:t xml:space="preserve"> </w:t>
+      </w:r>
+      <w:r>
+        <w:t xml:space="preserve">One line each: the claim, the number with unit and period (using the locked definitions), the source ID and location (section, table, page), and a status:</w:t>
       </w:r>
       <w:r>
         <w:t xml:space="preserve"> </w:t>
@@ -9370,6 +9745,28 @@
           <w:bCs/>
           <w:b/>
         </w:rPr>
+        <w:t xml:space="preserve">Triangulated:</w:t>
+      </w:r>
+      <w:r>
+        <w:t xml:space="preserve"> </w:t>
+      </w:r>
+      <w:r>
+        <w:t xml:space="preserve">two independent methods agree within the tolerance</w:t>
+      </w:r>
+      <w:r>
+        <w:t xml:space="preserve"> </w:t>
+      </w:r>
+      <w:r>
+        <w:t xml:space="preserve">-</w:t>
+      </w:r>
+      <w:r>
+        <w:t xml:space="preserve"> </w:t>
+      </w:r>
+      <w:r>
+        <w:rPr>
+          <w:bCs/>
+          <w:b/>
+        </w:rPr>
         <w:t xml:space="preserve">Inferred:</w:t>
       </w:r>
       <w:r>
@@ -9406,7 +9803,7 @@
         <w:pStyle w:val="BodyText"/>
       </w:pPr>
       <w:r>
-        <w:t xml:space="preserve">Any number that drives the answer needs two independent sources, or it is flagged single-source.</w:t>
+        <w:t xml:space="preserve">Any number that drives the answer needs two independent sources or two methods, or it is flagged single-source.</w:t>
       </w:r>
     </w:p>
     <w:p>
@@ -9418,7 +9815,43 @@
           <w:bCs/>
           <w:b/>
         </w:rPr>
-        <w:t xml:space="preserve">10. Check recency.</w:t>
+        <w:t xml:space="preserve">14. Triangulate.</w:t>
+      </w:r>
+      <w:r>
+        <w:t xml:space="preserve"> </w:t>
+      </w:r>
+      <w:r>
+        <w:t xml:space="preserve">For each estimated number, put the routes side by side in the triangulation table. If they differ by more than the tolerance (default 25%, set it for the engagement and mark it as an assumption), find the reason before you report: a definition, a period, a scope, or a wrong input. Do not average two numbers that disagree.</w:t>
+      </w:r>
+    </w:p>
+    <w:p>
+      <w:pPr>
+        <w:pStyle w:val="BodyText"/>
+      </w:pPr>
+      <w:r>
+        <w:rPr>
+          <w:bCs/>
+          <w:b/>
+        </w:rPr>
+        <w:t xml:space="preserve">15. Check in at the halfway point.</w:t>
+      </w:r>
+      <w:r>
+        <w:t xml:space="preserve"> </w:t>
+      </w:r>
+      <w:r>
+        <w:t xml:space="preserve">When about half the time box or budget is spent, send the EM a short note: what we found, what changed or surprised us, what we will cut or add, and any question we need a steer on. Wait for the steer before you spend the second half, unless the user said to continue.</w:t>
+      </w:r>
+    </w:p>
+    <w:p>
+      <w:pPr>
+        <w:pStyle w:val="BodyText"/>
+      </w:pPr>
+      <w:r>
+        <w:rPr>
+          <w:bCs/>
+          <w:b/>
+        </w:rPr>
+        <w:t xml:space="preserve">16. Check recency.</w:t>
       </w:r>
       <w:r>
         <w:t xml:space="preserve"> </w:t>
@@ -9436,13 +9869,13 @@
           <w:bCs/>
           <w:b/>
         </w:rPr>
-        <w:t xml:space="preserve">11. Handle conflicts and walls.</w:t>
-      </w:r>
-      <w:r>
-        <w:t xml:space="preserve"> </w:t>
-      </w:r>
-      <w:r>
-        <w:t xml:space="preserve">When sources disagree, show both values and the reason they may differ (definition, period, scope). Do not pick silently. When a page is paywalled, blocked, or will not load, log it as unreachable and ask you to supply the file. Do not try to get around it.</w:t>
+        <w:t xml:space="preserve">17. Handle conflicts and walls.</w:t>
+      </w:r>
+      <w:r>
+        <w:t xml:space="preserve"> </w:t>
+      </w:r>
+      <w:r>
+        <w:t xml:space="preserve">When sources disagree, show both values and the reason they may differ (definition, period, scope). Do not pick silently. When a page is paywalled, blocked, or will not load, log it as unreachable and ask the user to supply the file. Do not try to get around it.</w:t>
       </w:r>
     </w:p>
     <w:p>
@@ -9454,7 +9887,7 @@
           <w:bCs/>
           <w:b/>
         </w:rPr>
-        <w:t xml:space="preserve">12. Stop</w:t>
+        <w:t xml:space="preserve">18. Stop</w:t>
       </w:r>
       <w:r>
         <w:t xml:space="preserve"> </w:t>
@@ -9463,8 +9896,8 @@
         <w:t xml:space="preserve">by the stop rule. List what is still open.</w:t>
       </w:r>
     </w:p>
-    <w:bookmarkEnd w:id="149"/>
-    <w:bookmarkStart w:id="150" w:name="phase-c-synthesize"/>
+    <w:bookmarkEnd w:id="150"/>
+    <w:bookmarkStart w:id="151" w:name="phase-c-synthesize"/>
     <w:p>
       <w:pPr>
         <w:pStyle w:val="Heading4"/>
@@ -9482,7 +9915,7 @@
           <w:bCs/>
           <w:b/>
         </w:rPr>
-        <w:t xml:space="preserve">13. Write the answer first.</w:t>
+        <w:t xml:space="preserve">19. Write the answer first.</w:t>
       </w:r>
       <w:r>
         <w:t xml:space="preserve"> </w:t>
@@ -9500,13 +9933,13 @@
           <w:bCs/>
           <w:b/>
         </w:rPr>
-        <w:t xml:space="preserve">14. Findings by research question,</w:t>
-      </w:r>
-      <w:r>
-        <w:t xml:space="preserve"> </w:t>
-      </w:r>
-      <w:r>
-        <w:t xml:space="preserve">each with its claims, grades, and the effect on the hypothesis (supports, weakens, no effect) with strength: strong (grade A, corroborated), medium (grade B or one A), weak (grade C or inferred).</w:t>
+        <w:t xml:space="preserve">20. Findings by research question,</w:t>
+      </w:r>
+      <w:r>
+        <w:t xml:space="preserve"> </w:t>
+      </w:r>
+      <w:r>
+        <w:t xml:space="preserve">each with its claims, grades, method, and the effect on the hypothesis (supports, weakens, no effect) with strength: strong (grade A and corroborated or triangulated), medium (grade B or one A), weak (grade C or inferred).</w:t>
       </w:r>
     </w:p>
     <w:p>
@@ -9518,13 +9951,13 @@
           <w:bCs/>
           <w:b/>
         </w:rPr>
-        <w:t xml:space="preserve">15. Close the gaps.</w:t>
-      </w:r>
-      <w:r>
-        <w:t xml:space="preserve"> </w:t>
-      </w:r>
-      <w:r>
-        <w:t xml:space="preserve">For each open item name the next move: an expert interview (the interview-guide playbook), a client data request (the data-request playbook), a model run, or park it.</w:t>
+        <w:t xml:space="preserve">21. Close the gaps.</w:t>
+      </w:r>
+      <w:r>
+        <w:t xml:space="preserve"> </w:t>
+      </w:r>
+      <w:r>
+        <w:t xml:space="preserve">For each open item name the next move: an expert interview (the interview-guide playbook), a client data request (the data-request playbook), a database request, a model run, or park it.</w:t>
       </w:r>
     </w:p>
     <w:p>
@@ -9536,13 +9969,13 @@
           <w:bCs/>
           <w:b/>
         </w:rPr>
-        <w:t xml:space="preserve">16. Hand off.</w:t>
-      </w:r>
-      <w:r>
-        <w:t xml:space="preserve"> </w:t>
-      </w:r>
-      <w:r>
-        <w:t xml:space="preserve">Propose the updates to the hypothesis log, fact base, and risk register as a list. Apply nothing to</w:t>
+        <w:t xml:space="preserve">22. Hand off.</w:t>
+      </w:r>
+      <w:r>
+        <w:t xml:space="preserve"> </w:t>
+      </w:r>
+      <w:r>
+        <w:t xml:space="preserve">Propose the updates to the hypothesis log, fact base, definitions, and risk register as a list. Apply nothing to</w:t>
       </w:r>
       <w:r>
         <w:t xml:space="preserve"> </w:t>
@@ -9567,9 +10000,9 @@
         </w:pict>
       </w:r>
     </w:p>
-    <w:bookmarkEnd w:id="150"/>
     <w:bookmarkEnd w:id="151"/>
-    <w:bookmarkStart w:id="152" w:name="common-mistakes-3"/>
+    <w:bookmarkEnd w:id="152"/>
+    <w:bookmarkStart w:id="153" w:name="common-mistakes-3"/>
     <w:p>
       <w:pPr>
         <w:pStyle w:val="Heading3"/>
@@ -9594,7 +10027,140 @@
         <w:t xml:space="preserve">Searching before planning</w:t>
       </w:r>
       <w:r>
-        <w:t xml:space="preserve">: Twenty random searches produce a pile, not an answer. Write the research questions first.</w:t>
+        <w:t xml:space="preserve">: Twenty random searches produce a pile, not an answer. Write the brief and the research questions first.</w:t>
+      </w:r>
+    </w:p>
+    <w:p>
+      <w:pPr>
+        <w:numPr>
+          <w:ilvl w:val="0"/>
+          <w:numId w:val="1019"/>
+        </w:numPr>
+        <w:pStyle w:val="Compact"/>
+      </w:pPr>
+      <w:r>
+        <w:rPr>
+          <w:bCs/>
+          <w:b/>
+        </w:rPr>
+        <w:t xml:space="preserve">Questions that do not map to the issue tree</w:t>
+      </w:r>
+      <w:r>
+        <w:t xml:space="preserve">: They overlap or leave a hole. Run the MECE check against the branch.</w:t>
+      </w:r>
+    </w:p>
+    <w:p>
+      <w:pPr>
+        <w:numPr>
+          <w:ilvl w:val="0"/>
+          <w:numId w:val="1019"/>
+        </w:numPr>
+        <w:pStyle w:val="Compact"/>
+      </w:pPr>
+      <w:r>
+        <w:rPr>
+          <w:bCs/>
+          <w:b/>
+        </w:rPr>
+        <w:t xml:space="preserve">Researching everything</w:t>
+      </w:r>
+      <w:r>
+        <w:t xml:space="preserve">: Rank by impact and cut. Seven questions answered well beat fifteen skimmed.</w:t>
+      </w:r>
+    </w:p>
+    <w:p>
+      <w:pPr>
+        <w:numPr>
+          <w:ilvl w:val="0"/>
+          <w:numId w:val="1019"/>
+        </w:numPr>
+        <w:pStyle w:val="Compact"/>
+      </w:pPr>
+      <w:r>
+        <w:rPr>
+          <w:bCs/>
+          <w:b/>
+        </w:rPr>
+        <w:t xml:space="preserve">Planning on web search alone</w:t>
+      </w:r>
+      <w:r>
+        <w:t xml:space="preserve">: Prices, share data, and internal figures sit behind databases, experts, or the client. Flag them in the plan and request access early.</w:t>
+      </w:r>
+    </w:p>
+    <w:p>
+      <w:pPr>
+        <w:numPr>
+          <w:ilvl w:val="0"/>
+          <w:numId w:val="1019"/>
+        </w:numPr>
+        <w:pStyle w:val="Compact"/>
+      </w:pPr>
+      <w:r>
+        <w:rPr>
+          <w:bCs/>
+          <w:b/>
+        </w:rPr>
+        <w:t xml:space="preserve">Averaging two numbers that disagree</w:t>
+      </w:r>
+      <w:r>
+        <w:t xml:space="preserve">: Find why they differ. Do not blend them.</w:t>
+      </w:r>
+    </w:p>
+    <w:p>
+      <w:pPr>
+        <w:numPr>
+          <w:ilvl w:val="0"/>
+          <w:numId w:val="1019"/>
+        </w:numPr>
+        <w:pStyle w:val="Compact"/>
+      </w:pPr>
+      <w:r>
+        <w:rPr>
+          <w:bCs/>
+          <w:b/>
+        </w:rPr>
+        <w:t xml:space="preserve">Skipping the halfway check-in</w:t>
+      </w:r>
+      <w:r>
+        <w:t xml:space="preserve">: Find out at 50% of the budget that the research is off target, not at 100%.</w:t>
+      </w:r>
+    </w:p>
+    <w:p>
+      <w:pPr>
+        <w:numPr>
+          <w:ilvl w:val="0"/>
+          <w:numId w:val="1019"/>
+        </w:numPr>
+        <w:pStyle w:val="Compact"/>
+      </w:pPr>
+      <w:r>
+        <w:rPr>
+          <w:bCs/>
+          <w:b/>
+        </w:rPr>
+        <w:t xml:space="preserve">Leaving definitions loose</w:t>
+      </w:r>
+      <w:r>
+        <w:t xml:space="preserve">: Lock the terms first or the numbers will not compare.</w:t>
+      </w:r>
+    </w:p>
+    <w:p>
+      <w:pPr>
+        <w:numPr>
+          <w:ilvl w:val="0"/>
+          <w:numId w:val="1019"/>
+        </w:numPr>
+        <w:pStyle w:val="Compact"/>
+      </w:pPr>
+      <w:r>
+        <w:rPr>
+          <w:bCs/>
+          <w:b/>
+        </w:rPr>
+        <w:t xml:space="preserve">Taking non-public information on a listed company</w:t>
+      </w:r>
+      <w:r>
+        <w:t xml:space="preserve">: Stop and ask compliance.</w:t>
       </w:r>
     </w:p>
     <w:p>
@@ -9756,8 +10322,8 @@
         </w:pict>
       </w:r>
     </w:p>
-    <w:bookmarkEnd w:id="152"/>
-    <w:bookmarkStart w:id="153" w:name="structured-output-template-7"/>
+    <w:bookmarkEnd w:id="153"/>
+    <w:bookmarkStart w:id="154" w:name="structured-output-template-7"/>
     <w:p>
       <w:pPr>
         <w:pStyle w:val="Heading3"/>
@@ -9801,7 +10367,7 @@
         <w:rPr>
           <w:rStyle w:val="OtherTok"/>
         </w:rPr>
-        <w:t xml:space="preserve">Question, decision it feeds, depth, time box, and what would change our mind</w:t>
+        <w:t xml:space="preserve">Question, decision it feeds, and what would change our mind</w:t>
       </w:r>
       <w:r>
         <w:rPr>
@@ -9819,7 +10385,7 @@
         <w:rPr>
           <w:rStyle w:val="FunctionTok"/>
         </w:rPr>
-        <w:t xml:space="preserve">## Research questions</w:t>
+        <w:t xml:space="preserve">## Research brief</w:t>
       </w:r>
       <w:r>
         <w:br/>
@@ -9828,7 +10394,13 @@
         <w:rPr>
           <w:rStyle w:val="NormalTok"/>
         </w:rPr>
-        <w:t xml:space="preserve">| ID | Research question | Hypothesis tested | Result that would weaken it | Source types (grade) | Queries | Date window |</w:t>
+        <w:t xml:space="preserve">**Decision:** [ ] **User:** [ ] **Format:** [ ] **Due:** [ ] **Depth and time box:** </w:t>
+      </w:r>
+      <w:r>
+        <w:rPr>
+          <w:rStyle w:val="CommentTok"/>
+        </w:rPr>
+        <w:t xml:space="preserve">[ ]</w:t>
       </w:r>
       <w:r>
         <w:br/>
@@ -9837,7 +10409,37 @@
         <w:rPr>
           <w:rStyle w:val="NormalTok"/>
         </w:rPr>
-        <w:t xml:space="preserve">|---|---|---|---|---|---|---|</w:t>
+        <w:t xml:space="preserve">**Midpoint check-in:** </w:t>
+      </w:r>
+      <w:r>
+        <w:rPr>
+          <w:rStyle w:val="CommentTok"/>
+        </w:rPr>
+        <w:t xml:space="preserve">[</w:t>
+      </w:r>
+      <w:r>
+        <w:rPr>
+          <w:rStyle w:val="OtherTok"/>
+        </w:rPr>
+        <w:t xml:space="preserve">date, who</w:t>
+      </w:r>
+      <w:r>
+        <w:rPr>
+          <w:rStyle w:val="CommentTok"/>
+        </w:rPr>
+        <w:t xml:space="preserve">]</w:t>
+      </w:r>
+      <w:r>
+        <w:br/>
+      </w:r>
+      <w:r>
+        <w:br/>
+      </w:r>
+      <w:r>
+        <w:rPr>
+          <w:rStyle w:val="FunctionTok"/>
+        </w:rPr>
+        <w:t xml:space="preserve">## Definitions (locked)</w:t>
       </w:r>
       <w:r>
         <w:br/>
@@ -9846,7 +10448,16 @@
         <w:rPr>
           <w:rStyle w:val="NormalTok"/>
         </w:rPr>
-        <w:t xml:space="preserve">| R1 | | H1 | | A: ; B: | | |</w:t>
+        <w:t xml:space="preserve">| Term | Scope | Period | Geography | Unit | Confirmed by |</w:t>
+      </w:r>
+      <w:r>
+        <w:br/>
+      </w:r>
+      <w:r>
+        <w:rPr>
+          <w:rStyle w:val="NormalTok"/>
+        </w:rPr>
+        <w:t xml:space="preserve">|---|---|---|---|---|---|</w:t>
       </w:r>
       <w:r>
         <w:br/>
@@ -9858,6 +10469,171 @@
         <w:rPr>
           <w:rStyle w:val="FunctionTok"/>
         </w:rPr>
+        <w:t xml:space="preserve">## Research questions (from issue tree branch [ID])</w:t>
+      </w:r>
+      <w:r>
+        <w:br/>
+      </w:r>
+      <w:r>
+        <w:rPr>
+          <w:rStyle w:val="NormalTok"/>
+        </w:rPr>
+        <w:t xml:space="preserve">| ID | Leaf | Research question | Hypothesis tested | Result that would weaken it | Impact | Gap | Reach | Rank |</w:t>
+      </w:r>
+      <w:r>
+        <w:br/>
+      </w:r>
+      <w:r>
+        <w:rPr>
+          <w:rStyle w:val="NormalTok"/>
+        </w:rPr>
+        <w:t xml:space="preserve">|---|---|---|---|---|---|---|---|---|</w:t>
+      </w:r>
+      <w:r>
+        <w:br/>
+      </w:r>
+      <w:r>
+        <w:rPr>
+          <w:rStyle w:val="NormalTok"/>
+        </w:rPr>
+        <w:t xml:space="preserve">| R1 | | | H1 | | H | H | M | 1 |</w:t>
+      </w:r>
+      <w:r>
+        <w:br/>
+      </w:r>
+      <w:r>
+        <w:br/>
+      </w:r>
+      <w:r>
+        <w:rPr>
+          <w:rStyle w:val="NormalTok"/>
+        </w:rPr>
+        <w:t xml:space="preserve">**MECE check:** </w:t>
+      </w:r>
+      <w:r>
+        <w:rPr>
+          <w:rStyle w:val="CommentTok"/>
+        </w:rPr>
+        <w:t xml:space="preserve">[</w:t>
+      </w:r>
+      <w:r>
+        <w:rPr>
+          <w:rStyle w:val="OtherTok"/>
+        </w:rPr>
+        <w:t xml:space="preserve">Overlaps: none / list. Gaps: none / list. Leaves left out and why.</w:t>
+      </w:r>
+      <w:r>
+        <w:rPr>
+          <w:rStyle w:val="CommentTok"/>
+        </w:rPr>
+        <w:t xml:space="preserve">]</w:t>
+      </w:r>
+      <w:r>
+        <w:br/>
+      </w:r>
+      <w:r>
+        <w:rPr>
+          <w:rStyle w:val="NormalTok"/>
+        </w:rPr>
+        <w:t xml:space="preserve">**Parked or cut:** </w:t>
+      </w:r>
+      <w:r>
+        <w:rPr>
+          <w:rStyle w:val="CommentTok"/>
+        </w:rPr>
+        <w:t xml:space="preserve">[</w:t>
+      </w:r>
+      <w:r>
+        <w:rPr>
+          <w:rStyle w:val="OtherTok"/>
+        </w:rPr>
+        <w:t xml:space="preserve">Questions and why</w:t>
+      </w:r>
+      <w:r>
+        <w:rPr>
+          <w:rStyle w:val="CommentTok"/>
+        </w:rPr>
+        <w:t xml:space="preserve">]</w:t>
+      </w:r>
+      <w:r>
+        <w:br/>
+      </w:r>
+      <w:r>
+        <w:br/>
+      </w:r>
+      <w:r>
+        <w:rPr>
+          <w:rStyle w:val="FunctionTok"/>
+        </w:rPr>
+        <w:t xml:space="preserve">## Source and method plan</w:t>
+      </w:r>
+      <w:r>
+        <w:br/>
+      </w:r>
+      <w:r>
+        <w:rPr>
+          <w:rStyle w:val="NormalTok"/>
+        </w:rPr>
+        <w:t xml:space="preserve">| ID | Sources in order (reach: have / ask / no) | Method (two routes) | Queries | Date window |</w:t>
+      </w:r>
+      <w:r>
+        <w:br/>
+      </w:r>
+      <w:r>
+        <w:rPr>
+          <w:rStyle w:val="NormalTok"/>
+        </w:rPr>
+        <w:t xml:space="preserve">|---|---|---|---|---|</w:t>
+      </w:r>
+      <w:r>
+        <w:br/>
+      </w:r>
+      <w:r>
+        <w:rPr>
+          <w:rStyle w:val="NormalTok"/>
+        </w:rPr>
+        <w:t xml:space="preserve">| R1 | 1 client data (have); 3 Capital IQ (ask); 4 10-K (have) | Top-down and bottom-up | | |</w:t>
+      </w:r>
+      <w:r>
+        <w:br/>
+      </w:r>
+      <w:r>
+        <w:br/>
+      </w:r>
+      <w:r>
+        <w:rPr>
+          <w:rStyle w:val="FunctionTok"/>
+        </w:rPr>
+        <w:t xml:space="preserve">## Questions the web cannot answer alone</w:t>
+      </w:r>
+      <w:r>
+        <w:br/>
+      </w:r>
+      <w:r>
+        <w:rPr>
+          <w:rStyle w:val="NormalTok"/>
+        </w:rPr>
+        <w:t xml:space="preserve">| ID | What we need | How | Owner | Needed by |</w:t>
+      </w:r>
+      <w:r>
+        <w:br/>
+      </w:r>
+      <w:r>
+        <w:rPr>
+          <w:rStyle w:val="NormalTok"/>
+        </w:rPr>
+        <w:t xml:space="preserve">|---|---|---|---|---|</w:t>
+      </w:r>
+      <w:r>
+        <w:br/>
+      </w:r>
+      <w:r>
+        <w:br/>
+      </w:r>
+      <w:r>
+        <w:rPr>
+          <w:rStyle w:val="FunctionTok"/>
+        </w:rPr>
         <w:t xml:space="preserve">## Budget and stop rule</w:t>
       </w:r>
       <w:r>
@@ -9873,7 +10649,7 @@
         <w:rPr>
           <w:rStyle w:val="OtherTok"/>
         </w:rPr>
-        <w:t xml:space="preserve">Searches, fetches, time box, stop rule</w:t>
+        <w:t xml:space="preserve">Searches, fetches, expert calls, time box, stop rule, triangulation tolerance (assumption)</w:t>
       </w:r>
       <w:r>
         <w:rPr>
@@ -9891,7 +10667,7 @@
         <w:rPr>
           <w:rStyle w:val="FunctionTok"/>
         </w:rPr>
-        <w:t xml:space="preserve">## Confidentiality check</w:t>
+        <w:t xml:space="preserve">## Confidentiality and compliance check</w:t>
       </w:r>
       <w:r>
         <w:br/>
@@ -9906,7 +10682,7 @@
         <w:rPr>
           <w:rStyle w:val="OtherTok"/>
         </w:rPr>
-        <w:t xml:space="preserve">Terms kept out of queries; web tools approved: yes/no</w:t>
+        <w:t xml:space="preserve">Terms kept out of queries. Web tools approved: yes/no. Listed companies involved: yes/no, MNPI rule noted. Expert network rules confirmed: yes/no/not needed.</w:t>
       </w:r>
       <w:r>
         <w:rPr>
@@ -10001,6 +10777,39 @@
         <w:rPr>
           <w:rStyle w:val="FunctionTok"/>
         </w:rPr>
+        <w:t xml:space="preserve">## Midpoint note (sent [date])</w:t>
+      </w:r>
+      <w:r>
+        <w:br/>
+      </w:r>
+      <w:r>
+        <w:rPr>
+          <w:rStyle w:val="CommentTok"/>
+        </w:rPr>
+        <w:t xml:space="preserve">[</w:t>
+      </w:r>
+      <w:r>
+        <w:rPr>
+          <w:rStyle w:val="OtherTok"/>
+        </w:rPr>
+        <w:t xml:space="preserve">What we found, what changed, what we cut or added, the steer received</w:t>
+      </w:r>
+      <w:r>
+        <w:rPr>
+          <w:rStyle w:val="CommentTok"/>
+        </w:rPr>
+        <w:t xml:space="preserve">]</w:t>
+      </w:r>
+      <w:r>
+        <w:br/>
+      </w:r>
+      <w:r>
+        <w:br/>
+      </w:r>
+      <w:r>
+        <w:rPr>
+          <w:rStyle w:val="FunctionTok"/>
+        </w:rPr>
         <w:t xml:space="preserve">## Findings</w:t>
       </w:r>
       <w:r>
@@ -10100,6 +10909,36 @@
         <w:rPr>
           <w:rStyle w:val="FunctionTok"/>
         </w:rPr>
+        <w:t xml:space="preserve">## Triangulation</w:t>
+      </w:r>
+      <w:r>
+        <w:br/>
+      </w:r>
+      <w:r>
+        <w:rPr>
+          <w:rStyle w:val="NormalTok"/>
+        </w:rPr>
+        <w:t xml:space="preserve">| Number | Route 1 | Route 2 | Gap % | Within tolerance | Reason for gap |</w:t>
+      </w:r>
+      <w:r>
+        <w:br/>
+      </w:r>
+      <w:r>
+        <w:rPr>
+          <w:rStyle w:val="NormalTok"/>
+        </w:rPr>
+        <w:t xml:space="preserve">|---|---|---|---|---|---|</w:t>
+      </w:r>
+      <w:r>
+        <w:br/>
+      </w:r>
+      <w:r>
+        <w:br/>
+      </w:r>
+      <w:r>
+        <w:rPr>
+          <w:rStyle w:val="FunctionTok"/>
+        </w:rPr>
         <w:t xml:space="preserve">## Conflicts</w:t>
       </w:r>
       <w:r>
@@ -10178,7 +11017,7 @@
         <w:rPr>
           <w:rStyle w:val="OtherTok"/>
         </w:rPr>
-        <w:t xml:space="preserve">Hypothesis log, fact base, risk register: exact text, evidence, confidence</w:t>
+        <w:t xml:space="preserve">Hypothesis log, fact base, definitions, risk register: exact text, evidence, confidence</w:t>
       </w:r>
       <w:r>
         <w:rPr>
@@ -10205,7 +11044,7 @@
         <w:rPr>
           <w:rStyle w:val="NormalTok"/>
         </w:rPr>
-        <w:t xml:space="preserve">| ID | URL | Publisher | Date published | Date accessed | Type | Grade |</w:t>
+        <w:t xml:space="preserve">| ID | URL or reference | Publisher | Date published | Date accessed | Type | Grade |</w:t>
       </w:r>
       <w:r>
         <w:br/>
@@ -10266,8 +11105,8 @@
         </w:pict>
       </w:r>
     </w:p>
-    <w:bookmarkEnd w:id="153"/>
-    <w:bookmarkStart w:id="155" w:name="output-integration-7"/>
+    <w:bookmarkEnd w:id="154"/>
+    <w:bookmarkStart w:id="156" w:name="output-integration-7"/>
     <w:p>
       <w:pPr>
         <w:pStyle w:val="Heading3"/>
@@ -10276,7 +11115,7 @@
         <w:t xml:space="preserve">Output Integration</w:t>
       </w:r>
     </w:p>
-    <w:bookmarkStart w:id="154" w:name="cross-skill-integration-7"/>
+    <w:bookmarkStart w:id="155" w:name="cross-skill-integration-7"/>
     <w:p>
       <w:pPr>
         <w:pStyle w:val="Heading4"/>
@@ -10332,6 +11171,12 @@
       <w:r>
         <w:t xml:space="preserve">- the risk-register playbook - Risks the research surfaced</w:t>
       </w:r>
+      <w:r>
+        <w:t xml:space="preserve"> </w:t>
+      </w:r>
+      <w:r>
+        <w:t xml:space="preserve">- the decision-doc playbook - Agreed definitions</w:t>
+      </w:r>
     </w:p>
     <w:p>
       <w:pPr>
@@ -10343,6 +11188,18 @@
           <w:b/>
         </w:rPr>
         <w:t xml:space="preserve">Pulls from:</w:t>
+      </w:r>
+      <w:r>
+        <w:t xml:space="preserve"> </w:t>
+      </w:r>
+      <w:r>
+        <w:t xml:space="preserve">- the issue-tree playbook - The branch and leaves the questions map to</w:t>
+      </w:r>
+      <w:r>
+        <w:t xml:space="preserve"> </w:t>
+      </w:r>
+      <w:r>
+        <w:t xml:space="preserve">- the prioritize-analyses playbook - Ranking when many questions compete</w:t>
       </w:r>
       <w:r>
         <w:t xml:space="preserve"> </w:t>
@@ -10378,9 +11235,9 @@
         </w:pict>
       </w:r>
     </w:p>
-    <w:bookmarkEnd w:id="154"/>
     <w:bookmarkEnd w:id="155"/>
-    <w:bookmarkStart w:id="156" w:name="output-quality-self-check-7"/>
+    <w:bookmarkEnd w:id="156"/>
+    <w:bookmarkStart w:id="157" w:name="output-quality-self-check-7"/>
     <w:p>
       <w:pPr>
         <w:pStyle w:val="Heading3"/>
@@ -10416,6 +11273,118 @@
           <w:bCs/>
           <w:b/>
         </w:rPr>
+        <w:t xml:space="preserve">Research brief</w:t>
+      </w:r>
+      <w:r>
+        <w:t xml:space="preserve"> </w:t>
+      </w:r>
+      <w:r>
+        <w:t xml:space="preserve">names the decision, user, format, due date, and check-in</w:t>
+      </w:r>
+    </w:p>
+    <w:p>
+      <w:pPr>
+        <w:numPr>
+          <w:ilvl w:val="0"/>
+          <w:numId w:val="1020"/>
+        </w:numPr>
+        <w:pStyle w:val="Compact"/>
+      </w:pPr>
+      <w:r>
+        <w:t xml:space="preserve">☐</w:t>
+      </w:r>
+      <w:r>
+        <w:t xml:space="preserve"> </w:t>
+      </w:r>
+      <w:r>
+        <w:rPr>
+          <w:bCs/>
+          <w:b/>
+        </w:rPr>
+        <w:t xml:space="preserve">Definitions</w:t>
+      </w:r>
+      <w:r>
+        <w:t xml:space="preserve"> </w:t>
+      </w:r>
+      <w:r>
+        <w:t xml:space="preserve">are locked and confirmed</w:t>
+      </w:r>
+    </w:p>
+    <w:p>
+      <w:pPr>
+        <w:numPr>
+          <w:ilvl w:val="0"/>
+          <w:numId w:val="1020"/>
+        </w:numPr>
+        <w:pStyle w:val="Compact"/>
+      </w:pPr>
+      <w:r>
+        <w:t xml:space="preserve">☐</w:t>
+      </w:r>
+      <w:r>
+        <w:t xml:space="preserve"> </w:t>
+      </w:r>
+      <w:r>
+        <w:rPr>
+          <w:bCs/>
+          <w:b/>
+        </w:rPr>
+        <w:t xml:space="preserve">Research questions</w:t>
+      </w:r>
+      <w:r>
+        <w:t xml:space="preserve"> </w:t>
+      </w:r>
+      <w:r>
+        <w:t xml:space="preserve">map to issue-tree leaves, and the MECE check is shown</w:t>
+      </w:r>
+    </w:p>
+    <w:p>
+      <w:pPr>
+        <w:numPr>
+          <w:ilvl w:val="0"/>
+          <w:numId w:val="1020"/>
+        </w:numPr>
+        <w:pStyle w:val="Compact"/>
+      </w:pPr>
+      <w:r>
+        <w:t xml:space="preserve">☐</w:t>
+      </w:r>
+      <w:r>
+        <w:t xml:space="preserve"> </w:t>
+      </w:r>
+      <w:r>
+        <w:rPr>
+          <w:bCs/>
+          <w:b/>
+        </w:rPr>
+        <w:t xml:space="preserve">Questions are ranked</w:t>
+      </w:r>
+      <w:r>
+        <w:t xml:space="preserve"> </w:t>
+      </w:r>
+      <w:r>
+        <w:t xml:space="preserve">by impact, gap, and reach, with cuts listed</w:t>
+      </w:r>
+    </w:p>
+    <w:p>
+      <w:pPr>
+        <w:numPr>
+          <w:ilvl w:val="0"/>
+          <w:numId w:val="1020"/>
+        </w:numPr>
+        <w:pStyle w:val="Compact"/>
+      </w:pPr>
+      <w:r>
+        <w:t xml:space="preserve">☐</w:t>
+      </w:r>
+      <w:r>
+        <w:t xml:space="preserve"> </w:t>
+      </w:r>
+      <w:r>
+        <w:rPr>
+          <w:bCs/>
+          <w:b/>
+        </w:rPr>
         <w:t xml:space="preserve">Plan approved</w:t>
       </w:r>
       <w:r>
@@ -10472,6 +11441,146 @@
           <w:bCs/>
           <w:b/>
         </w:rPr>
+        <w:t xml:space="preserve">Sources beyond the web</w:t>
+      </w:r>
+      <w:r>
+        <w:t xml:space="preserve"> </w:t>
+      </w:r>
+      <w:r>
+        <w:t xml:space="preserve">are planned, with reach marked have, ask, or no</w:t>
+      </w:r>
+    </w:p>
+    <w:p>
+      <w:pPr>
+        <w:numPr>
+          <w:ilvl w:val="0"/>
+          <w:numId w:val="1020"/>
+        </w:numPr>
+        <w:pStyle w:val="Compact"/>
+      </w:pPr>
+      <w:r>
+        <w:t xml:space="preserve">☐</w:t>
+      </w:r>
+      <w:r>
+        <w:t xml:space="preserve"> </w:t>
+      </w:r>
+      <w:r>
+        <w:rPr>
+          <w:bCs/>
+          <w:b/>
+        </w:rPr>
+        <w:t xml:space="preserve">Questions the web cannot answer</w:t>
+      </w:r>
+      <w:r>
+        <w:t xml:space="preserve"> </w:t>
+      </w:r>
+      <w:r>
+        <w:t xml:space="preserve">each have a request and an owner</w:t>
+      </w:r>
+    </w:p>
+    <w:p>
+      <w:pPr>
+        <w:numPr>
+          <w:ilvl w:val="0"/>
+          <w:numId w:val="1020"/>
+        </w:numPr>
+        <w:pStyle w:val="Compact"/>
+      </w:pPr>
+      <w:r>
+        <w:t xml:space="preserve">☐</w:t>
+      </w:r>
+      <w:r>
+        <w:t xml:space="preserve"> </w:t>
+      </w:r>
+      <w:r>
+        <w:rPr>
+          <w:bCs/>
+          <w:b/>
+        </w:rPr>
+        <w:t xml:space="preserve">Two methods</w:t>
+      </w:r>
+      <w:r>
+        <w:t xml:space="preserve"> </w:t>
+      </w:r>
+      <w:r>
+        <w:t xml:space="preserve">planned for every estimated number</w:t>
+      </w:r>
+    </w:p>
+    <w:p>
+      <w:pPr>
+        <w:numPr>
+          <w:ilvl w:val="0"/>
+          <w:numId w:val="1020"/>
+        </w:numPr>
+        <w:pStyle w:val="Compact"/>
+      </w:pPr>
+      <w:r>
+        <w:t xml:space="preserve">☐</w:t>
+      </w:r>
+      <w:r>
+        <w:t xml:space="preserve"> </w:t>
+      </w:r>
+      <w:r>
+        <w:rPr>
+          <w:bCs/>
+          <w:b/>
+        </w:rPr>
+        <w:t xml:space="preserve">Compliance check</w:t>
+      </w:r>
+      <w:r>
+        <w:t xml:space="preserve"> </w:t>
+      </w:r>
+      <w:r>
+        <w:t xml:space="preserve">done: listed companies, MNPI, expert network rules</w:t>
+      </w:r>
+    </w:p>
+    <w:p>
+      <w:pPr>
+        <w:numPr>
+          <w:ilvl w:val="0"/>
+          <w:numId w:val="1020"/>
+        </w:numPr>
+        <w:pStyle w:val="Compact"/>
+      </w:pPr>
+      <w:r>
+        <w:t xml:space="preserve">☐</w:t>
+      </w:r>
+      <w:r>
+        <w:t xml:space="preserve"> </w:t>
+      </w:r>
+      <w:r>
+        <w:rPr>
+          <w:bCs/>
+          <w:b/>
+        </w:rPr>
+        <w:t xml:space="preserve">Midpoint check-in</w:t>
+      </w:r>
+      <w:r>
+        <w:t xml:space="preserve"> </w:t>
+      </w:r>
+      <w:r>
+        <w:t xml:space="preserve">sent and the steer recorded</w:t>
+      </w:r>
+    </w:p>
+    <w:p>
+      <w:pPr>
+        <w:numPr>
+          <w:ilvl w:val="0"/>
+          <w:numId w:val="1020"/>
+        </w:numPr>
+        <w:pStyle w:val="Compact"/>
+      </w:pPr>
+      <w:r>
+        <w:t xml:space="preserve">☐</w:t>
+      </w:r>
+      <w:r>
+        <w:t xml:space="preserve"> </w:t>
+      </w:r>
+      <w:r>
+        <w:rPr>
+          <w:bCs/>
+          <w:b/>
+        </w:rPr>
         <w:t xml:space="preserve">No client identifiers</w:t>
       </w:r>
       <w:r>
@@ -10562,7 +11671,35 @@
         <w:t xml:space="preserve"> </w:t>
       </w:r>
       <w:r>
-        <w:t xml:space="preserve">have two independent sources, or are flagged single-source</w:t>
+        <w:t xml:space="preserve">have two independent sources or two methods, or are flagged single-source</w:t>
+      </w:r>
+    </w:p>
+    <w:p>
+      <w:pPr>
+        <w:numPr>
+          <w:ilvl w:val="0"/>
+          <w:numId w:val="1020"/>
+        </w:numPr>
+        <w:pStyle w:val="Compact"/>
+      </w:pPr>
+      <w:r>
+        <w:t xml:space="preserve">☐</w:t>
+      </w:r>
+      <w:r>
+        <w:t xml:space="preserve"> </w:t>
+      </w:r>
+      <w:r>
+        <w:rPr>
+          <w:bCs/>
+          <w:b/>
+        </w:rPr>
+        <w:t xml:space="preserve">Triangulation gaps</w:t>
+      </w:r>
+      <w:r>
+        <w:t xml:space="preserve"> </w:t>
+      </w:r>
+      <w:r>
+        <w:t xml:space="preserve">above tolerance are explained, not averaged</w:t>
       </w:r>
     </w:p>
     <w:p>
@@ -10759,8 +11896,8 @@
         </w:pict>
       </w:r>
     </w:p>
-    <w:bookmarkEnd w:id="156"/>
-    <w:bookmarkStart w:id="157" w:name="related-skills-7"/>
+    <w:bookmarkEnd w:id="157"/>
+    <w:bookmarkStart w:id="158" w:name="related-skills-7"/>
     <w:p>
       <w:pPr>
         <w:pStyle w:val="Heading3"/>
@@ -10886,6 +12023,69 @@
         <w:rPr>
           <w:rStyle w:val="VerbatimChar"/>
         </w:rPr>
+        <w:t xml:space="preserve">issue-tree</w:t>
+      </w:r>
+      <w:r>
+        <w:t xml:space="preserve"> </w:t>
+      </w:r>
+      <w:r>
+        <w:t xml:space="preserve">- Source of the research questions</w:t>
+      </w:r>
+    </w:p>
+    <w:p>
+      <w:pPr>
+        <w:numPr>
+          <w:ilvl w:val="0"/>
+          <w:numId w:val="1021"/>
+        </w:numPr>
+        <w:pStyle w:val="Compact"/>
+      </w:pPr>
+      <w:r>
+        <w:rPr>
+          <w:rStyle w:val="VerbatimChar"/>
+        </w:rPr>
+        <w:t xml:space="preserve">prioritize-analyses</w:t>
+      </w:r>
+      <w:r>
+        <w:t xml:space="preserve"> </w:t>
+      </w:r>
+      <w:r>
+        <w:t xml:space="preserve">- Rank and cut when questions pile up</w:t>
+      </w:r>
+    </w:p>
+    <w:p>
+      <w:pPr>
+        <w:numPr>
+          <w:ilvl w:val="0"/>
+          <w:numId w:val="1021"/>
+        </w:numPr>
+        <w:pStyle w:val="Compact"/>
+      </w:pPr>
+      <w:r>
+        <w:rPr>
+          <w:rStyle w:val="VerbatimChar"/>
+        </w:rPr>
+        <w:t xml:space="preserve">decision-doc</w:t>
+      </w:r>
+      <w:r>
+        <w:t xml:space="preserve"> </w:t>
+      </w:r>
+      <w:r>
+        <w:t xml:space="preserve">- Log agreed definitions</w:t>
+      </w:r>
+    </w:p>
+    <w:p>
+      <w:pPr>
+        <w:numPr>
+          <w:ilvl w:val="0"/>
+          <w:numId w:val="1021"/>
+        </w:numPr>
+        <w:pStyle w:val="Compact"/>
+      </w:pPr>
+      <w:r>
+        <w:rPr>
+          <w:rStyle w:val="VerbatimChar"/>
+        </w:rPr>
         <w:t xml:space="preserve">interview-guide</w:t>
       </w:r>
       <w:r>
@@ -10937,9 +12137,9 @@
         <w:t xml:space="preserve">- Agree one number per metric</w:t>
       </w:r>
     </w:p>
-    <w:bookmarkEnd w:id="157"/>
     <w:bookmarkEnd w:id="158"/>
-    <w:bookmarkStart w:id="159" w:name="how-this-playbook-works-in-copilot-1"/>
+    <w:bookmarkEnd w:id="159"/>
+    <w:bookmarkStart w:id="160" w:name="how-this-playbook-works-in-copilot-1"/>
     <w:p>
       <w:pPr>
         <w:pStyle w:val="Heading2"/>
@@ -10963,8 +12163,8 @@
         </w:pict>
       </w:r>
     </w:p>
-    <w:bookmarkEnd w:id="159"/>
-    <w:bookmarkStart w:id="175" w:name="X5c451a89b80204fe25cea4c8e00baf3788aaa08"/>
+    <w:bookmarkEnd w:id="160"/>
+    <w:bookmarkStart w:id="176" w:name="X5c451a89b80204fe25cea4c8e00baf3788aaa08"/>
     <w:p>
       <w:pPr>
         <w:pStyle w:val="Heading2"/>
@@ -10973,7 +12173,7 @@
         <w:t xml:space="preserve">Playbook: Day-One Answer (name: day-one-answer)</w:t>
       </w:r>
     </w:p>
-    <w:bookmarkStart w:id="160" w:name="quick-start-8"/>
+    <w:bookmarkStart w:id="161" w:name="quick-start-8"/>
     <w:p>
       <w:pPr>
         <w:pStyle w:val="Heading3"/>
@@ -11141,8 +12341,8 @@
         <w:t xml:space="preserve">Mobilize; refreshed at gates</w:t>
       </w:r>
     </w:p>
-    <w:bookmarkEnd w:id="160"/>
-    <w:bookmarkStart w:id="163" w:name="step-1-diagnostic-questions-8"/>
+    <w:bookmarkEnd w:id="161"/>
+    <w:bookmarkStart w:id="164" w:name="step-1-diagnostic-questions-8"/>
     <w:p>
       <w:pPr>
         <w:pStyle w:val="Heading3"/>
@@ -11159,7 +12359,7 @@
         <w:t xml:space="preserve">Instead of a generic intake, I ask only what the files cannot answer:</w:t>
       </w:r>
     </w:p>
-    <w:bookmarkStart w:id="161" w:name="question-1-the-gut-answer"/>
+    <w:bookmarkStart w:id="162" w:name="question-1-the-gut-answer"/>
     <w:p>
       <w:pPr>
         <w:pStyle w:val="Heading4"/>
@@ -11188,8 +12388,8 @@
         <w:t xml:space="preserve">Forces a position that analysis can then test.</w:t>
       </w:r>
     </w:p>
-    <w:bookmarkEnd w:id="161"/>
-    <w:bookmarkStart w:id="162" w:name="question-2-the-flip"/>
+    <w:bookmarkEnd w:id="162"/>
+    <w:bookmarkStart w:id="163" w:name="question-2-the-flip"/>
     <w:p>
       <w:pPr>
         <w:pStyle w:val="Heading4"/>
@@ -11225,9 +12425,9 @@
         </w:pict>
       </w:r>
     </w:p>
-    <w:bookmarkEnd w:id="162"/>
     <w:bookmarkEnd w:id="163"/>
-    <w:bookmarkStart w:id="169" w:name="the-process-8"/>
+    <w:bookmarkEnd w:id="164"/>
+    <w:bookmarkStart w:id="170" w:name="the-process-8"/>
     <w:p>
       <w:pPr>
         <w:pStyle w:val="Heading3"/>
@@ -11236,7 +12436,7 @@
         <w:t xml:space="preserve">The Process</w:t>
       </w:r>
     </w:p>
-    <w:bookmarkStart w:id="164" w:name="step-1-state-the-answer-in-one-sentence"/>
+    <w:bookmarkStart w:id="165" w:name="step-1-state-the-answer-in-one-sentence"/>
     <w:p>
       <w:pPr>
         <w:pStyle w:val="Heading4"/>
@@ -11253,8 +12453,8 @@
         <w:t xml:space="preserve">Governing thought: recommendation plus size of prize plus main condition.</w:t>
       </w:r>
     </w:p>
-    <w:bookmarkEnd w:id="164"/>
-    <w:bookmarkStart w:id="165" w:name="step-2-list-what-must-be-true"/>
+    <w:bookmarkEnd w:id="165"/>
+    <w:bookmarkStart w:id="166" w:name="step-2-list-what-must-be-true"/>
     <w:p>
       <w:pPr>
         <w:pStyle w:val="Heading4"/>
@@ -11271,8 +12471,8 @@
         <w:t xml:space="preserve">Three to five conditions, each testable.</w:t>
       </w:r>
     </w:p>
-    <w:bookmarkEnd w:id="165"/>
-    <w:bookmarkStart w:id="166" w:name="step-3-link-to-analyses"/>
+    <w:bookmarkEnd w:id="166"/>
+    <w:bookmarkStart w:id="167" w:name="step-3-link-to-analyses"/>
     <w:p>
       <w:pPr>
         <w:pStyle w:val="Heading4"/>
@@ -11289,8 +12489,8 @@
         <w:t xml:space="preserve">One analysis per condition, ranked by uncertainty and impact.</w:t>
       </w:r>
     </w:p>
-    <w:bookmarkEnd w:id="166"/>
-    <w:bookmarkStart w:id="167" w:name="step-4-name-what-would-change-your-mind"/>
+    <w:bookmarkEnd w:id="167"/>
+    <w:bookmarkStart w:id="168" w:name="step-4-name-what-would-change-your-mind"/>
     <w:p>
       <w:pPr>
         <w:pStyle w:val="Heading4"/>
@@ -11307,8 +12507,8 @@
         <w:t xml:space="preserve">Specific data points or findings.</w:t>
       </w:r>
     </w:p>
-    <w:bookmarkEnd w:id="167"/>
-    <w:bookmarkStart w:id="168" w:name="step-5-version-it"/>
+    <w:bookmarkEnd w:id="168"/>
+    <w:bookmarkStart w:id="169" w:name="step-5-version-it"/>
     <w:p>
       <w:pPr>
         <w:pStyle w:val="Heading4"/>
@@ -11332,9 +12532,9 @@
         </w:pict>
       </w:r>
     </w:p>
-    <w:bookmarkEnd w:id="168"/>
     <w:bookmarkEnd w:id="169"/>
-    <w:bookmarkStart w:id="170" w:name="structured-output-template-8"/>
+    <w:bookmarkEnd w:id="170"/>
+    <w:bookmarkStart w:id="171" w:name="structured-output-template-8"/>
     <w:p>
       <w:pPr>
         <w:pStyle w:val="Heading3"/>
@@ -11490,8 +12690,8 @@
         </w:pict>
       </w:r>
     </w:p>
-    <w:bookmarkEnd w:id="170"/>
-    <w:bookmarkStart w:id="172" w:name="output-integration-8"/>
+    <w:bookmarkEnd w:id="171"/>
+    <w:bookmarkStart w:id="173" w:name="output-integration-8"/>
     <w:p>
       <w:pPr>
         <w:pStyle w:val="Heading3"/>
@@ -11500,7 +12700,7 @@
         <w:t xml:space="preserve">Output Integration</w:t>
       </w:r>
     </w:p>
-    <w:bookmarkStart w:id="171" w:name="cross-skill-integration-8"/>
+    <w:bookmarkStart w:id="172" w:name="cross-skill-integration-8"/>
     <w:p>
       <w:pPr>
         <w:pStyle w:val="Heading4"/>
@@ -11578,9 +12778,9 @@
         </w:pict>
       </w:r>
     </w:p>
-    <w:bookmarkEnd w:id="171"/>
     <w:bookmarkEnd w:id="172"/>
-    <w:bookmarkStart w:id="173" w:name="output-quality-self-check-8"/>
+    <w:bookmarkEnd w:id="173"/>
+    <w:bookmarkStart w:id="174" w:name="output-quality-self-check-8"/>
     <w:p>
       <w:pPr>
         <w:pStyle w:val="Heading3"/>
@@ -11791,8 +12991,8 @@
         </w:pict>
       </w:r>
     </w:p>
-    <w:bookmarkEnd w:id="173"/>
-    <w:bookmarkStart w:id="174" w:name="related-skills-8"/>
+    <w:bookmarkEnd w:id="174"/>
+    <w:bookmarkStart w:id="175" w:name="related-skills-8"/>
     <w:p>
       <w:pPr>
         <w:pStyle w:val="Heading3"/>
@@ -11864,9 +13064,9 @@
         <w:t xml:space="preserve">- Challenge the answer</w:t>
       </w:r>
     </w:p>
-    <w:bookmarkEnd w:id="174"/>
     <w:bookmarkEnd w:id="175"/>
-    <w:bookmarkStart w:id="191" w:name="playbook-issue-tree-name-issue-tree"/>
+    <w:bookmarkEnd w:id="176"/>
+    <w:bookmarkStart w:id="192" w:name="playbook-issue-tree-name-issue-tree"/>
     <w:p>
       <w:pPr>
         <w:pStyle w:val="Heading2"/>
@@ -11875,7 +13075,7 @@
         <w:t xml:space="preserve">Playbook: Issue Tree (name: issue-tree)</w:t>
       </w:r>
     </w:p>
-    <w:bookmarkStart w:id="176" w:name="quick-start-9"/>
+    <w:bookmarkStart w:id="177" w:name="quick-start-9"/>
     <w:p>
       <w:pPr>
         <w:pStyle w:val="Heading3"/>
@@ -12046,8 +13246,8 @@
         <w:t xml:space="preserve">Mobilize</w:t>
       </w:r>
     </w:p>
-    <w:bookmarkEnd w:id="176"/>
-    <w:bookmarkStart w:id="179" w:name="step-1-diagnostic-questions-9"/>
+    <w:bookmarkEnd w:id="177"/>
+    <w:bookmarkStart w:id="180" w:name="step-1-diagnostic-questions-9"/>
     <w:p>
       <w:pPr>
         <w:pStyle w:val="Heading3"/>
@@ -12064,7 +13264,7 @@
         <w:t xml:space="preserve">Instead of a generic intake, I ask only what the files cannot answer:</w:t>
       </w:r>
     </w:p>
-    <w:bookmarkStart w:id="177" w:name="question-1-the-tree-type"/>
+    <w:bookmarkStart w:id="178" w:name="question-1-the-tree-type"/>
     <w:p>
       <w:pPr>
         <w:pStyle w:val="Heading4"/>
@@ -12093,8 +13293,8 @@
         <w:t xml:space="preserve">Mixing types is the commonest MECE failure.</w:t>
       </w:r>
     </w:p>
-    <w:bookmarkEnd w:id="177"/>
-    <w:bookmarkStart w:id="178" w:name="question-2-the-cut"/>
+    <w:bookmarkEnd w:id="178"/>
+    <w:bookmarkStart w:id="179" w:name="question-2-the-cut"/>
     <w:p>
       <w:pPr>
         <w:pStyle w:val="Heading4"/>
@@ -12130,9 +13330,9 @@
         </w:pict>
       </w:r>
     </w:p>
-    <w:bookmarkEnd w:id="178"/>
     <w:bookmarkEnd w:id="179"/>
-    <w:bookmarkStart w:id="185" w:name="the-process-9"/>
+    <w:bookmarkEnd w:id="180"/>
+    <w:bookmarkStart w:id="186" w:name="the-process-9"/>
     <w:p>
       <w:pPr>
         <w:pStyle w:val="Heading3"/>
@@ -12141,7 +13341,7 @@
         <w:t xml:space="preserve">The Process</w:t>
       </w:r>
     </w:p>
-    <w:bookmarkStart w:id="180" w:name="step-1-choose-tree-type"/>
+    <w:bookmarkStart w:id="181" w:name="step-1-choose-tree-type"/>
     <w:p>
       <w:pPr>
         <w:pStyle w:val="Heading4"/>
@@ -12158,8 +13358,8 @@
         <w:t xml:space="preserve">Diagnostic (why), solution (how), or value-driver.</w:t>
       </w:r>
     </w:p>
-    <w:bookmarkEnd w:id="180"/>
-    <w:bookmarkStart w:id="181" w:name="step-2-draft-level-1"/>
+    <w:bookmarkEnd w:id="181"/>
+    <w:bookmarkStart w:id="182" w:name="step-2-draft-level-1"/>
     <w:p>
       <w:pPr>
         <w:pStyle w:val="Heading4"/>
@@ -12176,8 +13376,8 @@
         <w:t xml:space="preserve">Two to five branches. Test: mutually exclusive, collectively exhaustive.</w:t>
       </w:r>
     </w:p>
-    <w:bookmarkEnd w:id="181"/>
-    <w:bookmarkStart w:id="182" w:name="step-3-draft-levels-2-and-3"/>
+    <w:bookmarkEnd w:id="182"/>
+    <w:bookmarkStart w:id="183" w:name="step-3-draft-levels-2-and-3"/>
     <w:p>
       <w:pPr>
         <w:pStyle w:val="Heading4"/>
@@ -12194,8 +13394,8 @@
         <w:t xml:space="preserve">Stop at leaves that can be tested with a specific analysis.</w:t>
       </w:r>
     </w:p>
-    <w:bookmarkEnd w:id="182"/>
-    <w:bookmarkStart w:id="183" w:name="step-4-run-the-mece-test"/>
+    <w:bookmarkEnd w:id="183"/>
+    <w:bookmarkStart w:id="184" w:name="step-4-run-the-mece-test"/>
     <w:p>
       <w:pPr>
         <w:pStyle w:val="Heading4"/>
@@ -12212,8 +13412,8 @@
         <w:t xml:space="preserve">Look for overlaps (same item in two branches) and gaps (what is missing).</w:t>
       </w:r>
     </w:p>
-    <w:bookmarkEnd w:id="183"/>
-    <w:bookmarkStart w:id="184" w:name="step-5-tag-leaves"/>
+    <w:bookmarkEnd w:id="184"/>
+    <w:bookmarkStart w:id="185" w:name="step-5-tag-leaves"/>
     <w:p>
       <w:pPr>
         <w:pStyle w:val="Heading4"/>
@@ -12237,9 +13437,9 @@
         </w:pict>
       </w:r>
     </w:p>
-    <w:bookmarkEnd w:id="184"/>
     <w:bookmarkEnd w:id="185"/>
-    <w:bookmarkStart w:id="186" w:name="structured-output-template-9"/>
+    <w:bookmarkEnd w:id="186"/>
+    <w:bookmarkStart w:id="187" w:name="structured-output-template-9"/>
     <w:p>
       <w:pPr>
         <w:pStyle w:val="Heading3"/>
@@ -12390,8 +13590,8 @@
         </w:pict>
       </w:r>
     </w:p>
-    <w:bookmarkEnd w:id="186"/>
-    <w:bookmarkStart w:id="188" w:name="output-integration-9"/>
+    <w:bookmarkEnd w:id="187"/>
+    <w:bookmarkStart w:id="189" w:name="output-integration-9"/>
     <w:p>
       <w:pPr>
         <w:pStyle w:val="Heading3"/>
@@ -12400,7 +13600,7 @@
         <w:t xml:space="preserve">Output Integration</w:t>
       </w:r>
     </w:p>
-    <w:bookmarkStart w:id="187" w:name="cross-skill-integration-9"/>
+    <w:bookmarkStart w:id="188" w:name="cross-skill-integration-9"/>
     <w:p>
       <w:pPr>
         <w:pStyle w:val="Heading4"/>
@@ -12478,9 +13678,9 @@
         </w:pict>
       </w:r>
     </w:p>
-    <w:bookmarkEnd w:id="187"/>
     <w:bookmarkEnd w:id="188"/>
-    <w:bookmarkStart w:id="189" w:name="output-quality-self-check-9"/>
+    <w:bookmarkEnd w:id="189"/>
+    <w:bookmarkStart w:id="190" w:name="output-quality-self-check-9"/>
     <w:p>
       <w:pPr>
         <w:pStyle w:val="Heading3"/>
@@ -12719,8 +13919,8 @@
         </w:pict>
       </w:r>
     </w:p>
-    <w:bookmarkEnd w:id="189"/>
-    <w:bookmarkStart w:id="190" w:name="related-skills-9"/>
+    <w:bookmarkEnd w:id="190"/>
+    <w:bookmarkStart w:id="191" w:name="related-skills-9"/>
     <w:p>
       <w:pPr>
         <w:pStyle w:val="Heading3"/>
@@ -12792,9 +13992,9 @@
         <w:t xml:space="preserve">- Quantify drivers</w:t>
       </w:r>
     </w:p>
-    <w:bookmarkEnd w:id="190"/>
     <w:bookmarkEnd w:id="191"/>
-    <w:bookmarkStart w:id="207" w:name="Xb073154bde3adc879682c5cc4ee07bff4bd6823"/>
+    <w:bookmarkEnd w:id="192"/>
+    <w:bookmarkStart w:id="208" w:name="Xb073154bde3adc879682c5cc4ee07bff4bd6823"/>
     <w:p>
       <w:pPr>
         <w:pStyle w:val="Heading2"/>
@@ -12803,7 +14003,7 @@
         <w:t xml:space="preserve">Playbook: Hypothesis Draft (name: hypothesis-draft)</w:t>
       </w:r>
     </w:p>
-    <w:bookmarkStart w:id="192" w:name="quick-start-10"/>
+    <w:bookmarkStart w:id="193" w:name="quick-start-10"/>
     <w:p>
       <w:pPr>
         <w:pStyle w:val="Heading3"/>
@@ -12968,8 +14168,8 @@
         <w:t xml:space="preserve">Mobilize through Recommend</w:t>
       </w:r>
     </w:p>
-    <w:bookmarkEnd w:id="192"/>
-    <w:bookmarkStart w:id="195" w:name="step-1-diagnostic-questions-10"/>
+    <w:bookmarkEnd w:id="193"/>
+    <w:bookmarkStart w:id="196" w:name="step-1-diagnostic-questions-10"/>
     <w:p>
       <w:pPr>
         <w:pStyle w:val="Heading3"/>
@@ -12986,7 +14186,7 @@
         <w:t xml:space="preserve">Instead of a generic intake, I ask only what the files cannot answer:</w:t>
       </w:r>
     </w:p>
-    <w:bookmarkStart w:id="193" w:name="question-1-the-kill-test"/>
+    <w:bookmarkStart w:id="194" w:name="question-1-the-kill-test"/>
     <w:p>
       <w:pPr>
         <w:pStyle w:val="Heading4"/>
@@ -13015,8 +14215,8 @@
         <w:t xml:space="preserve">If nothing would, it is a belief, not a hypothesis.</w:t>
       </w:r>
     </w:p>
-    <w:bookmarkEnd w:id="193"/>
-    <w:bookmarkStart w:id="194" w:name="question-2-the-threshold"/>
+    <w:bookmarkEnd w:id="194"/>
+    <w:bookmarkStart w:id="195" w:name="question-2-the-threshold"/>
     <w:p>
       <w:pPr>
         <w:pStyle w:val="Heading4"/>
@@ -13052,9 +14252,9 @@
         </w:pict>
       </w:r>
     </w:p>
-    <w:bookmarkEnd w:id="194"/>
     <w:bookmarkEnd w:id="195"/>
-    <w:bookmarkStart w:id="201" w:name="the-process-10"/>
+    <w:bookmarkEnd w:id="196"/>
+    <w:bookmarkStart w:id="202" w:name="the-process-10"/>
     <w:p>
       <w:pPr>
         <w:pStyle w:val="Heading3"/>
@@ -13063,7 +14263,7 @@
         <w:t xml:space="preserve">The Process</w:t>
       </w:r>
     </w:p>
-    <w:bookmarkStart w:id="196" w:name="step-1-write-one-hypothesis-per-leaf"/>
+    <w:bookmarkStart w:id="197" w:name="step-1-write-one-hypothesis-per-leaf"/>
     <w:p>
       <w:pPr>
         <w:pStyle w:val="Heading4"/>
@@ -13080,8 +14280,8 @@
         <w:t xml:space="preserve">Specific, falsifiable, with direction and size where possible.</w:t>
       </w:r>
     </w:p>
-    <w:bookmarkEnd w:id="196"/>
-    <w:bookmarkStart w:id="197" w:name="step-2-define-the-test"/>
+    <w:bookmarkEnd w:id="197"/>
+    <w:bookmarkStart w:id="198" w:name="step-2-define-the-test"/>
     <w:p>
       <w:pPr>
         <w:pStyle w:val="Heading4"/>
@@ -13098,8 +14298,8 @@
         <w:t xml:space="preserve">Analysis, data, threshold, owner, date.</w:t>
       </w:r>
     </w:p>
-    <w:bookmarkEnd w:id="197"/>
-    <w:bookmarkStart w:id="198" w:name="step-3-log-evidence"/>
+    <w:bookmarkEnd w:id="198"/>
+    <w:bookmarkStart w:id="199" w:name="step-3-log-evidence"/>
     <w:p>
       <w:pPr>
         <w:pStyle w:val="Heading4"/>
@@ -13116,8 +14316,8 @@
         <w:t xml:space="preserve">For and against, with source and confidence.</w:t>
       </w:r>
     </w:p>
-    <w:bookmarkEnd w:id="198"/>
-    <w:bookmarkStart w:id="199" w:name="step-4-update-status"/>
+    <w:bookmarkEnd w:id="199"/>
+    <w:bookmarkStart w:id="200" w:name="step-4-update-status"/>
     <w:p>
       <w:pPr>
         <w:pStyle w:val="Heading4"/>
@@ -13134,8 +14334,8 @@
         <w:t xml:space="preserve">Open, supported, partly supported, rejected; note what changed.</w:t>
       </w:r>
     </w:p>
-    <w:bookmarkEnd w:id="199"/>
-    <w:bookmarkStart w:id="200" w:name="step-5-reshape-the-answer"/>
+    <w:bookmarkEnd w:id="200"/>
+    <w:bookmarkStart w:id="201" w:name="step-5-reshape-the-answer"/>
     <w:p>
       <w:pPr>
         <w:pStyle w:val="Heading4"/>
@@ -13159,9 +14359,9 @@
         </w:pict>
       </w:r>
     </w:p>
-    <w:bookmarkEnd w:id="200"/>
     <w:bookmarkEnd w:id="201"/>
-    <w:bookmarkStart w:id="202" w:name="structured-output-template-10"/>
+    <w:bookmarkEnd w:id="202"/>
+    <w:bookmarkStart w:id="203" w:name="structured-output-template-10"/>
     <w:p>
       <w:pPr>
         <w:pStyle w:val="Heading3"/>
@@ -13275,8 +14475,8 @@
         </w:pict>
       </w:r>
     </w:p>
-    <w:bookmarkEnd w:id="202"/>
-    <w:bookmarkStart w:id="204" w:name="output-integration-10"/>
+    <w:bookmarkEnd w:id="203"/>
+    <w:bookmarkStart w:id="205" w:name="output-integration-10"/>
     <w:p>
       <w:pPr>
         <w:pStyle w:val="Heading3"/>
@@ -13285,7 +14485,7 @@
         <w:t xml:space="preserve">Output Integration</w:t>
       </w:r>
     </w:p>
-    <w:bookmarkStart w:id="203" w:name="cross-skill-integration-10"/>
+    <w:bookmarkStart w:id="204" w:name="cross-skill-integration-10"/>
     <w:p>
       <w:pPr>
         <w:pStyle w:val="Heading4"/>
@@ -13375,9 +14575,9 @@
         </w:pict>
       </w:r>
     </w:p>
-    <w:bookmarkEnd w:id="203"/>
     <w:bookmarkEnd w:id="204"/>
-    <w:bookmarkStart w:id="205" w:name="output-quality-self-check-10"/>
+    <w:bookmarkEnd w:id="205"/>
+    <w:bookmarkStart w:id="206" w:name="output-quality-self-check-10"/>
     <w:p>
       <w:pPr>
         <w:pStyle w:val="Heading3"/>
@@ -13616,8 +14816,8 @@
         </w:pict>
       </w:r>
     </w:p>
-    <w:bookmarkEnd w:id="205"/>
-    <w:bookmarkStart w:id="206" w:name="related-skills-10"/>
+    <w:bookmarkEnd w:id="206"/>
+    <w:bookmarkStart w:id="207" w:name="related-skills-10"/>
     <w:p>
       <w:pPr>
         <w:pStyle w:val="Heading3"/>
@@ -13689,9 +14889,9 @@
         <w:t xml:space="preserve">- Challenge the evidence</w:t>
       </w:r>
     </w:p>
-    <w:bookmarkEnd w:id="206"/>
     <w:bookmarkEnd w:id="207"/>
-    <w:bookmarkStart w:id="223" w:name="Xb7fac45183d14e583b082b9fbabc7b8888e0f76"/>
+    <w:bookmarkEnd w:id="208"/>
+    <w:bookmarkStart w:id="224" w:name="Xb7fac45183d14e583b082b9fbabc7b8888e0f76"/>
     <w:p>
       <w:pPr>
         <w:pStyle w:val="Heading2"/>
@@ -13700,7 +14900,7 @@
         <w:t xml:space="preserve">Playbook: Prioritize Analyses (name: prioritize-analyses)</w:t>
       </w:r>
     </w:p>
-    <w:bookmarkStart w:id="208" w:name="quick-start-11"/>
+    <w:bookmarkStart w:id="209" w:name="quick-start-11"/>
     <w:p>
       <w:pPr>
         <w:pStyle w:val="Heading3"/>
@@ -13871,8 +15071,8 @@
         <w:t xml:space="preserve">Mobilize and Diagnose</w:t>
       </w:r>
     </w:p>
-    <w:bookmarkEnd w:id="208"/>
-    <w:bookmarkStart w:id="211" w:name="step-1-diagnostic-questions-11"/>
+    <w:bookmarkEnd w:id="209"/>
+    <w:bookmarkStart w:id="212" w:name="step-1-diagnostic-questions-11"/>
     <w:p>
       <w:pPr>
         <w:pStyle w:val="Heading3"/>
@@ -13889,7 +15089,7 @@
         <w:t xml:space="preserve">Instead of a generic intake, I ask only what the files cannot answer:</w:t>
       </w:r>
     </w:p>
-    <w:bookmarkStart w:id="209" w:name="question-1-the-gate"/>
+    <w:bookmarkStart w:id="210" w:name="question-1-the-gate"/>
     <w:p>
       <w:pPr>
         <w:pStyle w:val="Heading4"/>
@@ -13918,8 +15118,8 @@
         <w:t xml:space="preserve">Prioritize for the next decision, not for completeness.</w:t>
       </w:r>
     </w:p>
-    <w:bookmarkEnd w:id="209"/>
-    <w:bookmarkStart w:id="210" w:name="question-2-the-swing"/>
+    <w:bookmarkEnd w:id="210"/>
+    <w:bookmarkStart w:id="211" w:name="question-2-the-swing"/>
     <w:p>
       <w:pPr>
         <w:pStyle w:val="Heading4"/>
@@ -13955,9 +15155,9 @@
         </w:pict>
       </w:r>
     </w:p>
-    <w:bookmarkEnd w:id="210"/>
     <w:bookmarkEnd w:id="211"/>
-    <w:bookmarkStart w:id="217" w:name="the-process-11"/>
+    <w:bookmarkEnd w:id="212"/>
+    <w:bookmarkStart w:id="218" w:name="the-process-11"/>
     <w:p>
       <w:pPr>
         <w:pStyle w:val="Heading3"/>
@@ -13966,7 +15166,7 @@
         <w:t xml:space="preserve">The Process</w:t>
       </w:r>
     </w:p>
-    <w:bookmarkStart w:id="212" w:name="step-1-list-candidates"/>
+    <w:bookmarkStart w:id="213" w:name="step-1-list-candidates"/>
     <w:p>
       <w:pPr>
         <w:pStyle w:val="Heading4"/>
@@ -13983,8 +15183,8 @@
         <w:t xml:space="preserve">One line each with the hypothesis it tests.</w:t>
       </w:r>
     </w:p>
-    <w:bookmarkEnd w:id="212"/>
-    <w:bookmarkStart w:id="213" w:name="step-2-score-impact-and-effort"/>
+    <w:bookmarkEnd w:id="213"/>
+    <w:bookmarkStart w:id="214" w:name="step-2-score-impact-and-effort"/>
     <w:p>
       <w:pPr>
         <w:pStyle w:val="Heading4"/>
@@ -14001,8 +15201,8 @@
         <w:t xml:space="preserve">Impact on the answer 1 to 5; effort in days; data readiness; confidence in the result.</w:t>
       </w:r>
     </w:p>
-    <w:bookmarkEnd w:id="213"/>
-    <w:bookmarkStart w:id="214" w:name="step-3-plot-the-matrix"/>
+    <w:bookmarkEnd w:id="214"/>
+    <w:bookmarkStart w:id="215" w:name="step-3-plot-the-matrix"/>
     <w:p>
       <w:pPr>
         <w:pStyle w:val="Heading4"/>
@@ -14019,8 +15219,8 @@
         <w:t xml:space="preserve">Do now, schedule, quick check, park.</w:t>
       </w:r>
     </w:p>
-    <w:bookmarkEnd w:id="214"/>
-    <w:bookmarkStart w:id="215" w:name="step-4-apply-the-8020-rule"/>
+    <w:bookmarkEnd w:id="215"/>
+    <w:bookmarkStart w:id="216" w:name="step-4-apply-the-8020-rule"/>
     <w:p>
       <w:pPr>
         <w:pStyle w:val="Heading4"/>
@@ -14037,8 +15237,8 @@
         <w:t xml:space="preserve">Cut analyses that cannot change the answer.</w:t>
       </w:r>
     </w:p>
-    <w:bookmarkEnd w:id="215"/>
-    <w:bookmarkStart w:id="216" w:name="step-5-agree-with-the-em-1"/>
+    <w:bookmarkEnd w:id="216"/>
+    <w:bookmarkStart w:id="217" w:name="step-5-agree-with-the-em-1"/>
     <w:p>
       <w:pPr>
         <w:pStyle w:val="Heading4"/>
@@ -14062,9 +15262,9 @@
         </w:pict>
       </w:r>
     </w:p>
-    <w:bookmarkEnd w:id="216"/>
     <w:bookmarkEnd w:id="217"/>
-    <w:bookmarkStart w:id="218" w:name="structured-output-template-11"/>
+    <w:bookmarkEnd w:id="218"/>
+    <w:bookmarkStart w:id="219" w:name="structured-output-template-11"/>
     <w:p>
       <w:pPr>
         <w:pStyle w:val="Heading3"/>
@@ -14167,8 +15367,8 @@
         </w:pict>
       </w:r>
     </w:p>
-    <w:bookmarkEnd w:id="218"/>
-    <w:bookmarkStart w:id="220" w:name="output-integration-11"/>
+    <w:bookmarkEnd w:id="219"/>
+    <w:bookmarkStart w:id="221" w:name="output-integration-11"/>
     <w:p>
       <w:pPr>
         <w:pStyle w:val="Heading3"/>
@@ -14177,7 +15377,7 @@
         <w:t xml:space="preserve">Output Integration</w:t>
       </w:r>
     </w:p>
-    <w:bookmarkStart w:id="219" w:name="cross-skill-integration-11"/>
+    <w:bookmarkStart w:id="220" w:name="cross-skill-integration-11"/>
     <w:p>
       <w:pPr>
         <w:pStyle w:val="Heading4"/>
@@ -14249,9 +15449,9 @@
         </w:pict>
       </w:r>
     </w:p>
-    <w:bookmarkEnd w:id="219"/>
     <w:bookmarkEnd w:id="220"/>
-    <w:bookmarkStart w:id="221" w:name="output-quality-self-check-11"/>
+    <w:bookmarkEnd w:id="221"/>
+    <w:bookmarkStart w:id="222" w:name="output-quality-self-check-11"/>
     <w:p>
       <w:pPr>
         <w:pStyle w:val="Heading3"/>
@@ -14462,8 +15662,8 @@
         </w:pict>
       </w:r>
     </w:p>
-    <w:bookmarkEnd w:id="221"/>
-    <w:bookmarkStart w:id="222" w:name="related-skills-11"/>
+    <w:bookmarkEnd w:id="222"/>
+    <w:bookmarkStart w:id="223" w:name="related-skills-11"/>
     <w:p>
       <w:pPr>
         <w:pStyle w:val="Heading3"/>
@@ -14535,9 +15735,9 @@
         <w:t xml:space="preserve">- Log scope trade-offs</w:t>
       </w:r>
     </w:p>
-    <w:bookmarkEnd w:id="222"/>
     <w:bookmarkEnd w:id="223"/>
-    <w:bookmarkStart w:id="239" w:name="X05135e567a246e9caaa45094531e541965376c1"/>
+    <w:bookmarkEnd w:id="224"/>
+    <w:bookmarkStart w:id="240" w:name="X05135e567a246e9caaa45094531e541965376c1"/>
     <w:p>
       <w:pPr>
         <w:pStyle w:val="Heading2"/>
@@ -14546,7 +15746,7 @@
         <w:t xml:space="preserve">Playbook: Interview Guide (name: interview-guide)</w:t>
       </w:r>
     </w:p>
-    <w:bookmarkStart w:id="224" w:name="quick-start-12"/>
+    <w:bookmarkStart w:id="225" w:name="quick-start-12"/>
     <w:p>
       <w:pPr>
         <w:pStyle w:val="Heading3"/>
@@ -14723,8 +15923,8 @@
         <w:t xml:space="preserve">Diagnose</w:t>
       </w:r>
     </w:p>
-    <w:bookmarkEnd w:id="224"/>
-    <w:bookmarkStart w:id="227" w:name="step-1-diagnostic-questions-12"/>
+    <w:bookmarkEnd w:id="225"/>
+    <w:bookmarkStart w:id="228" w:name="step-1-diagnostic-questions-12"/>
     <w:p>
       <w:pPr>
         <w:pStyle w:val="Heading3"/>
@@ -14741,7 +15941,7 @@
         <w:t xml:space="preserve">Instead of a generic intake, I ask only what the files cannot answer:</w:t>
       </w:r>
     </w:p>
-    <w:bookmarkStart w:id="225" w:name="question-1-the-one-thing"/>
+    <w:bookmarkStart w:id="226" w:name="question-1-the-one-thing"/>
     <w:p>
       <w:pPr>
         <w:pStyle w:val="Heading4"/>
@@ -14770,8 +15970,8 @@
         <w:t xml:space="preserve">Everything else is optional; this question is mandatory.</w:t>
       </w:r>
     </w:p>
-    <w:bookmarkEnd w:id="225"/>
-    <w:bookmarkStart w:id="226" w:name="question-2-the-risk"/>
+    <w:bookmarkEnd w:id="226"/>
+    <w:bookmarkStart w:id="227" w:name="question-2-the-risk"/>
     <w:p>
       <w:pPr>
         <w:pStyle w:val="Heading4"/>
@@ -14807,9 +16007,9 @@
         </w:pict>
       </w:r>
     </w:p>
-    <w:bookmarkEnd w:id="226"/>
     <w:bookmarkEnd w:id="227"/>
-    <w:bookmarkStart w:id="233" w:name="the-process-12"/>
+    <w:bookmarkEnd w:id="228"/>
+    <w:bookmarkStart w:id="234" w:name="the-process-12"/>
     <w:p>
       <w:pPr>
         <w:pStyle w:val="Heading3"/>
@@ -14818,7 +16018,7 @@
         <w:t xml:space="preserve">The Process</w:t>
       </w:r>
     </w:p>
-    <w:bookmarkStart w:id="228" w:name="step-1-pick-the-objective"/>
+    <w:bookmarkStart w:id="229" w:name="step-1-pick-the-objective"/>
     <w:p>
       <w:pPr>
         <w:pStyle w:val="Heading4"/>
@@ -14835,8 +16035,8 @@
         <w:t xml:space="preserve">One sentence: what we need to learn and which hypothesis it supports.</w:t>
       </w:r>
     </w:p>
-    <w:bookmarkEnd w:id="228"/>
-    <w:bookmarkStart w:id="229" w:name="step-2-write-the-opener"/>
+    <w:bookmarkEnd w:id="229"/>
+    <w:bookmarkStart w:id="230" w:name="step-2-write-the-opener"/>
     <w:p>
       <w:pPr>
         <w:pStyle w:val="Heading4"/>
@@ -14853,8 +16053,8 @@
         <w:t xml:space="preserve">Purpose, confidentiality, how notes are used, time check.</w:t>
       </w:r>
     </w:p>
-    <w:bookmarkEnd w:id="229"/>
-    <w:bookmarkStart w:id="230" w:name="step-3-draft-6-to-8-open-questions"/>
+    <w:bookmarkEnd w:id="230"/>
+    <w:bookmarkStart w:id="231" w:name="step-3-draft-6-to-8-open-questions"/>
     <w:p>
       <w:pPr>
         <w:pStyle w:val="Heading4"/>
@@ -14871,8 +16071,8 @@
         <w:t xml:space="preserve">Start broad, narrow with probes. No leading questions.</w:t>
       </w:r>
     </w:p>
-    <w:bookmarkEnd w:id="230"/>
-    <w:bookmarkStart w:id="231" w:name="X41459cd5d4957322afb45f731d82cec2a5725a6"/>
+    <w:bookmarkEnd w:id="231"/>
+    <w:bookmarkStart w:id="232" w:name="X41459cd5d4957322afb45f731d82cec2a5725a6"/>
     <w:p>
       <w:pPr>
         <w:pStyle w:val="Heading4"/>
@@ -14889,8 +16089,8 @@
         <w:t xml:space="preserve">'Can you give an example?' 'How many?' 'How often?'</w:t>
       </w:r>
     </w:p>
-    <w:bookmarkEnd w:id="231"/>
-    <w:bookmarkStart w:id="232" w:name="step-5-close-and-next-steps"/>
+    <w:bookmarkEnd w:id="232"/>
+    <w:bookmarkStart w:id="233" w:name="step-5-close-and-next-steps"/>
     <w:p>
       <w:pPr>
         <w:pStyle w:val="Heading4"/>
@@ -14914,9 +16114,9 @@
         </w:pict>
       </w:r>
     </w:p>
-    <w:bookmarkEnd w:id="232"/>
     <w:bookmarkEnd w:id="233"/>
-    <w:bookmarkStart w:id="234" w:name="structured-output-template-12"/>
+    <w:bookmarkEnd w:id="234"/>
+    <w:bookmarkStart w:id="235" w:name="structured-output-template-12"/>
     <w:p>
       <w:pPr>
         <w:pStyle w:val="Heading3"/>
@@ -15132,8 +16332,8 @@
         </w:pict>
       </w:r>
     </w:p>
-    <w:bookmarkEnd w:id="234"/>
-    <w:bookmarkStart w:id="236" w:name="output-integration-12"/>
+    <w:bookmarkEnd w:id="235"/>
+    <w:bookmarkStart w:id="237" w:name="output-integration-12"/>
     <w:p>
       <w:pPr>
         <w:pStyle w:val="Heading3"/>
@@ -15142,7 +16342,7 @@
         <w:t xml:space="preserve">Output Integration</w:t>
       </w:r>
     </w:p>
-    <w:bookmarkStart w:id="235" w:name="cross-skill-integration-12"/>
+    <w:bookmarkStart w:id="236" w:name="cross-skill-integration-12"/>
     <w:p>
       <w:pPr>
         <w:pStyle w:val="Heading4"/>
@@ -15220,9 +16420,9 @@
         </w:pict>
       </w:r>
     </w:p>
-    <w:bookmarkEnd w:id="235"/>
     <w:bookmarkEnd w:id="236"/>
-    <w:bookmarkStart w:id="237" w:name="output-quality-self-check-12"/>
+    <w:bookmarkEnd w:id="237"/>
+    <w:bookmarkStart w:id="238" w:name="output-quality-self-check-12"/>
     <w:p>
       <w:pPr>
         <w:pStyle w:val="Heading3"/>
@@ -15461,8 +16661,8 @@
         </w:pict>
       </w:r>
     </w:p>
-    <w:bookmarkEnd w:id="237"/>
-    <w:bookmarkStart w:id="238" w:name="related-skills-12"/>
+    <w:bookmarkEnd w:id="238"/>
+    <w:bookmarkStart w:id="239" w:name="related-skills-12"/>
     <w:p>
       <w:pPr>
         <w:pStyle w:val="Heading3"/>
@@ -15534,9 +16734,9 @@
         <w:t xml:space="preserve">- Update hypotheses</w:t>
       </w:r>
     </w:p>
-    <w:bookmarkEnd w:id="238"/>
     <w:bookmarkEnd w:id="239"/>
-    <w:bookmarkStart w:id="255" w:name="X588a1215ad21705747f0ee3359afa84a884c8f0"/>
+    <w:bookmarkEnd w:id="240"/>
+    <w:bookmarkStart w:id="256" w:name="X588a1215ad21705747f0ee3359afa84a884c8f0"/>
     <w:p>
       <w:pPr>
         <w:pStyle w:val="Heading2"/>
@@ -15545,7 +16745,7 @@
         <w:t xml:space="preserve">Playbook: Interview Synthesis (name: interview-synthesis)</w:t>
       </w:r>
     </w:p>
-    <w:bookmarkStart w:id="240" w:name="quick-start-13"/>
+    <w:bookmarkStart w:id="241" w:name="quick-start-13"/>
     <w:p>
       <w:pPr>
         <w:pStyle w:val="Heading3"/>
@@ -15728,8 +16928,8 @@
         <w:t xml:space="preserve">Diagnose</w:t>
       </w:r>
     </w:p>
-    <w:bookmarkEnd w:id="240"/>
-    <w:bookmarkStart w:id="243" w:name="step-1-diagnostic-questions-13"/>
+    <w:bookmarkEnd w:id="241"/>
+    <w:bookmarkStart w:id="244" w:name="step-1-diagnostic-questions-13"/>
     <w:p>
       <w:pPr>
         <w:pStyle w:val="Heading3"/>
@@ -15746,7 +16946,7 @@
         <w:t xml:space="preserve">Instead of a generic intake, I ask only what the files cannot answer:</w:t>
       </w:r>
     </w:p>
-    <w:bookmarkStart w:id="241" w:name="question-1-the-weight"/>
+    <w:bookmarkStart w:id="242" w:name="question-1-the-weight"/>
     <w:p>
       <w:pPr>
         <w:pStyle w:val="Heading4"/>
@@ -15775,8 +16975,8 @@
         <w:t xml:space="preserve">Frontline vs executive views may diverge on purpose.</w:t>
       </w:r>
     </w:p>
-    <w:bookmarkEnd w:id="241"/>
-    <w:bookmarkStart w:id="242" w:name="question-2-the-surprise"/>
+    <w:bookmarkEnd w:id="242"/>
+    <w:bookmarkStart w:id="243" w:name="question-2-the-surprise"/>
     <w:p>
       <w:pPr>
         <w:pStyle w:val="Heading4"/>
@@ -15812,9 +17012,9 @@
         </w:pict>
       </w:r>
     </w:p>
-    <w:bookmarkEnd w:id="242"/>
     <w:bookmarkEnd w:id="243"/>
-    <w:bookmarkStart w:id="249" w:name="the-process-13"/>
+    <w:bookmarkEnd w:id="244"/>
+    <w:bookmarkStart w:id="250" w:name="the-process-13"/>
     <w:p>
       <w:pPr>
         <w:pStyle w:val="Heading3"/>
@@ -15823,7 +17023,7 @@
         <w:t xml:space="preserve">The Process</w:t>
       </w:r>
     </w:p>
-    <w:bookmarkStart w:id="244" w:name="step-1-code-the-notes"/>
+    <w:bookmarkStart w:id="245" w:name="step-1-code-the-notes"/>
     <w:p>
       <w:pPr>
         <w:pStyle w:val="Heading4"/>
@@ -15840,8 +17040,8 @@
         <w:t xml:space="preserve">Tag each statement with a theme, interviewee type, and fact vs opinion.</w:t>
       </w:r>
     </w:p>
-    <w:bookmarkEnd w:id="244"/>
-    <w:bookmarkStart w:id="245" w:name="step-2-count-and-cluster"/>
+    <w:bookmarkEnd w:id="245"/>
+    <w:bookmarkStart w:id="246" w:name="step-2-count-and-cluster"/>
     <w:p>
       <w:pPr>
         <w:pStyle w:val="Heading4"/>
@@ -15858,8 +17058,8 @@
         <w:t xml:space="preserve">Number of interviewees per theme and per segment.</w:t>
       </w:r>
     </w:p>
-    <w:bookmarkEnd w:id="245"/>
-    <w:bookmarkStart w:id="246" w:name="step-3-pick-verbatim-quotes"/>
+    <w:bookmarkEnd w:id="246"/>
+    <w:bookmarkStart w:id="247" w:name="step-3-pick-verbatim-quotes"/>
     <w:p>
       <w:pPr>
         <w:pStyle w:val="Heading4"/>
@@ -15876,8 +17076,8 @@
         <w:t xml:space="preserve">Two per major theme, anonymized unless agreed.</w:t>
       </w:r>
     </w:p>
-    <w:bookmarkEnd w:id="246"/>
-    <w:bookmarkStart w:id="247" w:name="step-4-flag-contradictions"/>
+    <w:bookmarkEnd w:id="247"/>
+    <w:bookmarkStart w:id="248" w:name="step-4-flag-contradictions"/>
     <w:p>
       <w:pPr>
         <w:pStyle w:val="Heading4"/>
@@ -15894,8 +17094,8 @@
         <w:t xml:space="preserve">Between groups, and between interviews and data.</w:t>
       </w:r>
     </w:p>
-    <w:bookmarkEnd w:id="247"/>
-    <w:bookmarkStart w:id="248" w:name="step-5-update-hypotheses"/>
+    <w:bookmarkEnd w:id="248"/>
+    <w:bookmarkStart w:id="249" w:name="step-5-update-hypotheses"/>
     <w:p>
       <w:pPr>
         <w:pStyle w:val="Heading4"/>
@@ -15919,9 +17119,9 @@
         </w:pict>
       </w:r>
     </w:p>
-    <w:bookmarkEnd w:id="248"/>
     <w:bookmarkEnd w:id="249"/>
-    <w:bookmarkStart w:id="250" w:name="structured-output-template-13"/>
+    <w:bookmarkEnd w:id="250"/>
+    <w:bookmarkStart w:id="251" w:name="structured-output-template-13"/>
     <w:p>
       <w:pPr>
         <w:pStyle w:val="Heading3"/>
@@ -16101,8 +17301,8 @@
         </w:pict>
       </w:r>
     </w:p>
-    <w:bookmarkEnd w:id="250"/>
-    <w:bookmarkStart w:id="252" w:name="output-integration-13"/>
+    <w:bookmarkEnd w:id="251"/>
+    <w:bookmarkStart w:id="253" w:name="output-integration-13"/>
     <w:p>
       <w:pPr>
         <w:pStyle w:val="Heading3"/>
@@ -16111,7 +17311,7 @@
         <w:t xml:space="preserve">Output Integration</w:t>
       </w:r>
     </w:p>
-    <w:bookmarkStart w:id="251" w:name="cross-skill-integration-13"/>
+    <w:bookmarkStart w:id="252" w:name="cross-skill-integration-13"/>
     <w:p>
       <w:pPr>
         <w:pStyle w:val="Heading4"/>
@@ -16189,9 +17389,9 @@
         </w:pict>
       </w:r>
     </w:p>
-    <w:bookmarkEnd w:id="251"/>
     <w:bookmarkEnd w:id="252"/>
-    <w:bookmarkStart w:id="253" w:name="output-quality-self-check-13"/>
+    <w:bookmarkEnd w:id="253"/>
+    <w:bookmarkStart w:id="254" w:name="output-quality-self-check-13"/>
     <w:p>
       <w:pPr>
         <w:pStyle w:val="Heading3"/>
@@ -16430,8 +17630,8 @@
         </w:pict>
       </w:r>
     </w:p>
-    <w:bookmarkEnd w:id="253"/>
-    <w:bookmarkStart w:id="254" w:name="related-skills-13"/>
+    <w:bookmarkEnd w:id="254"/>
+    <w:bookmarkStart w:id="255" w:name="related-skills-13"/>
     <w:p>
       <w:pPr>
         <w:pStyle w:val="Heading3"/>
@@ -16503,9 +17703,9 @@
         <w:t xml:space="preserve">- Use in the story</w:t>
       </w:r>
     </w:p>
-    <w:bookmarkEnd w:id="254"/>
     <w:bookmarkEnd w:id="255"/>
-    <w:bookmarkStart w:id="270" w:name="Xfe31077a89062833432e708c966649869b9f3b4"/>
+    <w:bookmarkEnd w:id="256"/>
+    <w:bookmarkStart w:id="271" w:name="Xfe31077a89062833432e708c966649869b9f3b4"/>
     <w:p>
       <w:pPr>
         <w:pStyle w:val="Heading2"/>
@@ -16514,7 +17714,7 @@
         <w:t xml:space="preserve">Playbook: Survey Design (name: survey-design)</w:t>
       </w:r>
     </w:p>
-    <w:bookmarkStart w:id="256" w:name="quick-start-14"/>
+    <w:bookmarkStart w:id="257" w:name="quick-start-14"/>
     <w:p>
       <w:pPr>
         <w:pStyle w:val="Heading3"/>
@@ -16679,8 +17879,8 @@
         <w:t xml:space="preserve">Diagnose</w:t>
       </w:r>
     </w:p>
-    <w:bookmarkEnd w:id="256"/>
-    <w:bookmarkStart w:id="258" w:name="step-1-diagnostic-questions-14"/>
+    <w:bookmarkEnd w:id="257"/>
+    <w:bookmarkStart w:id="259" w:name="step-1-diagnostic-questions-14"/>
     <w:p>
       <w:pPr>
         <w:pStyle w:val="Heading3"/>
@@ -16697,7 +17897,7 @@
         <w:t xml:space="preserve">Instead of a generic intake, I ask only what the files cannot answer:</w:t>
       </w:r>
     </w:p>
-    <w:bookmarkStart w:id="257" w:name="question-1-the-decision-3"/>
+    <w:bookmarkStart w:id="258" w:name="question-1-the-decision-2"/>
     <w:p>
       <w:pPr>
         <w:pStyle w:val="Heading4"/>
@@ -16733,9 +17933,9 @@
         </w:pict>
       </w:r>
     </w:p>
-    <w:bookmarkEnd w:id="257"/>
     <w:bookmarkEnd w:id="258"/>
-    <w:bookmarkStart w:id="264" w:name="the-process-14"/>
+    <w:bookmarkEnd w:id="259"/>
+    <w:bookmarkStart w:id="265" w:name="the-process-14"/>
     <w:p>
       <w:pPr>
         <w:pStyle w:val="Heading3"/>
@@ -16744,7 +17944,7 @@
         <w:t xml:space="preserve">The Process</w:t>
       </w:r>
     </w:p>
-    <w:bookmarkStart w:id="259" w:name="X0ede6453888d52ef69b17b277ae0b40676cccd4"/>
+    <w:bookmarkStart w:id="260" w:name="X0ede6453888d52ef69b17b277ae0b40676cccd4"/>
     <w:p>
       <w:pPr>
         <w:pStyle w:val="Heading4"/>
@@ -16761,8 +17961,8 @@
         <w:t xml:space="preserve">What result changes what.</w:t>
       </w:r>
     </w:p>
-    <w:bookmarkEnd w:id="259"/>
-    <w:bookmarkStart w:id="260" w:name="step-2-design-the-sample"/>
+    <w:bookmarkEnd w:id="260"/>
+    <w:bookmarkStart w:id="261" w:name="step-2-design-the-sample"/>
     <w:p>
       <w:pPr>
         <w:pStyle w:val="Heading4"/>
@@ -16779,8 +17979,8 @@
         <w:t xml:space="preserve">Segments, size, quotas, response rate assumption.</w:t>
       </w:r>
     </w:p>
-    <w:bookmarkEnd w:id="260"/>
-    <w:bookmarkStart w:id="261" w:name="step-3-write-questions"/>
+    <w:bookmarkEnd w:id="261"/>
+    <w:bookmarkStart w:id="262" w:name="step-3-write-questions"/>
     <w:p>
       <w:pPr>
         <w:pStyle w:val="Heading4"/>
@@ -16797,8 +17997,8 @@
         <w:t xml:space="preserve">Neutral, one idea per question, consistent scales.</w:t>
       </w:r>
     </w:p>
-    <w:bookmarkEnd w:id="261"/>
-    <w:bookmarkStart w:id="262" w:name="step-4-plan-the-analysis"/>
+    <w:bookmarkEnd w:id="262"/>
+    <w:bookmarkStart w:id="263" w:name="step-4-plan-the-analysis"/>
     <w:p>
       <w:pPr>
         <w:pStyle w:val="Heading4"/>
@@ -16815,8 +18015,8 @@
         <w:t xml:space="preserve">Cuts, significance, how results map to hypotheses.</w:t>
       </w:r>
     </w:p>
-    <w:bookmarkEnd w:id="262"/>
-    <w:bookmarkStart w:id="263" w:name="step-5-pilot"/>
+    <w:bookmarkEnd w:id="263"/>
+    <w:bookmarkStart w:id="264" w:name="step-5-pilot"/>
     <w:p>
       <w:pPr>
         <w:pStyle w:val="Heading4"/>
@@ -16840,9 +18040,9 @@
         </w:pict>
       </w:r>
     </w:p>
-    <w:bookmarkEnd w:id="263"/>
     <w:bookmarkEnd w:id="264"/>
-    <w:bookmarkStart w:id="265" w:name="structured-output-template-14"/>
+    <w:bookmarkEnd w:id="265"/>
+    <w:bookmarkStart w:id="266" w:name="structured-output-template-14"/>
     <w:p>
       <w:pPr>
         <w:pStyle w:val="Heading3"/>
@@ -17004,8 +18204,8 @@
         </w:pict>
       </w:r>
     </w:p>
-    <w:bookmarkEnd w:id="265"/>
-    <w:bookmarkStart w:id="267" w:name="output-integration-14"/>
+    <w:bookmarkEnd w:id="266"/>
+    <w:bookmarkStart w:id="268" w:name="output-integration-14"/>
     <w:p>
       <w:pPr>
         <w:pStyle w:val="Heading3"/>
@@ -17014,7 +18214,7 @@
         <w:t xml:space="preserve">Output Integration</w:t>
       </w:r>
     </w:p>
-    <w:bookmarkStart w:id="266" w:name="cross-skill-integration-14"/>
+    <w:bookmarkStart w:id="267" w:name="cross-skill-integration-14"/>
     <w:p>
       <w:pPr>
         <w:pStyle w:val="Heading4"/>
@@ -17080,9 +18280,9 @@
         </w:pict>
       </w:r>
     </w:p>
-    <w:bookmarkEnd w:id="266"/>
     <w:bookmarkEnd w:id="267"/>
-    <w:bookmarkStart w:id="268" w:name="output-quality-self-check-14"/>
+    <w:bookmarkEnd w:id="268"/>
+    <w:bookmarkStart w:id="269" w:name="output-quality-self-check-14"/>
     <w:p>
       <w:pPr>
         <w:pStyle w:val="Heading3"/>
@@ -17293,8 +18493,8 @@
         </w:pict>
       </w:r>
     </w:p>
-    <w:bookmarkEnd w:id="268"/>
-    <w:bookmarkStart w:id="269" w:name="related-skills-14"/>
+    <w:bookmarkEnd w:id="269"/>
+    <w:bookmarkStart w:id="270" w:name="related-skills-14"/>
     <w:p>
       <w:pPr>
         <w:pStyle w:val="Heading3"/>
@@ -17366,9 +18566,9 @@
         <w:t xml:space="preserve">- Test causes</w:t>
       </w:r>
     </w:p>
-    <w:bookmarkEnd w:id="269"/>
     <w:bookmarkEnd w:id="270"/>
-    <w:bookmarkStart w:id="285" w:name="playbook-fact-base-name-fact-base"/>
+    <w:bookmarkEnd w:id="271"/>
+    <w:bookmarkStart w:id="286" w:name="playbook-fact-base-name-fact-base"/>
     <w:p>
       <w:pPr>
         <w:pStyle w:val="Heading2"/>
@@ -17377,7 +18577,7 @@
         <w:t xml:space="preserve">Playbook: Fact Base (name: fact-base)</w:t>
       </w:r>
     </w:p>
-    <w:bookmarkStart w:id="271" w:name="quick-start-15"/>
+    <w:bookmarkStart w:id="272" w:name="quick-start-15"/>
     <w:p>
       <w:pPr>
         <w:pStyle w:val="Heading3"/>
@@ -17554,8 +18754,8 @@
         <w:t xml:space="preserve">Diagnose</w:t>
       </w:r>
     </w:p>
-    <w:bookmarkEnd w:id="271"/>
-    <w:bookmarkStart w:id="273" w:name="step-1-diagnostic-questions-15"/>
+    <w:bookmarkEnd w:id="272"/>
+    <w:bookmarkStart w:id="274" w:name="step-1-diagnostic-questions-15"/>
     <w:p>
       <w:pPr>
         <w:pStyle w:val="Heading3"/>
@@ -17572,7 +18772,7 @@
         <w:t xml:space="preserve">Instead of a generic intake, I ask only what the files cannot answer:</w:t>
       </w:r>
     </w:p>
-    <w:bookmarkStart w:id="272" w:name="question-1-the-source-of-truth"/>
+    <w:bookmarkStart w:id="273" w:name="question-1-the-source-of-truth"/>
     <w:p>
       <w:pPr>
         <w:pStyle w:val="Heading4"/>
@@ -17608,9 +18808,9 @@
         </w:pict>
       </w:r>
     </w:p>
-    <w:bookmarkEnd w:id="272"/>
     <w:bookmarkEnd w:id="273"/>
-    <w:bookmarkStart w:id="279" w:name="the-process-15"/>
+    <w:bookmarkEnd w:id="274"/>
+    <w:bookmarkStart w:id="280" w:name="the-process-15"/>
     <w:p>
       <w:pPr>
         <w:pStyle w:val="Heading3"/>
@@ -17619,7 +18819,7 @@
         <w:t xml:space="preserve">The Process</w:t>
       </w:r>
     </w:p>
-    <w:bookmarkStart w:id="274" w:name="step-1-list-the-metrics"/>
+    <w:bookmarkStart w:id="275" w:name="step-1-list-the-metrics"/>
     <w:p>
       <w:pPr>
         <w:pStyle w:val="Heading4"/>
@@ -17636,8 +18836,8 @@
         <w:t xml:space="preserve">Only those used on slides or in the model.</w:t>
       </w:r>
     </w:p>
-    <w:bookmarkEnd w:id="274"/>
-    <w:bookmarkStart w:id="275" w:name="step-2-assign-a-source-per-metric"/>
+    <w:bookmarkEnd w:id="275"/>
+    <w:bookmarkStart w:id="276" w:name="step-2-assign-a-source-per-metric"/>
     <w:p>
       <w:pPr>
         <w:pStyle w:val="Heading4"/>
@@ -17654,8 +18854,8 @@
         <w:t xml:space="preserve">With owner, date, and definition.</w:t>
       </w:r>
     </w:p>
-    <w:bookmarkEnd w:id="275"/>
-    <w:bookmarkStart w:id="276" w:name="step-3-reconcile-conflicts"/>
+    <w:bookmarkEnd w:id="276"/>
+    <w:bookmarkStart w:id="277" w:name="step-3-reconcile-conflicts"/>
     <w:p>
       <w:pPr>
         <w:pStyle w:val="Heading4"/>
@@ -17672,8 +18872,8 @@
         <w:t xml:space="preserve">Explain gaps and pick one number; log the decision.</w:t>
       </w:r>
     </w:p>
-    <w:bookmarkEnd w:id="276"/>
-    <w:bookmarkStart w:id="277" w:name="step-4-get-client-sign-off"/>
+    <w:bookmarkEnd w:id="277"/>
+    <w:bookmarkStart w:id="278" w:name="step-4-get-client-sign-off"/>
     <w:p>
       <w:pPr>
         <w:pStyle w:val="Heading4"/>
@@ -17690,8 +18890,8 @@
         <w:t xml:space="preserve">CFO or counterpart confirms.</w:t>
       </w:r>
     </w:p>
-    <w:bookmarkEnd w:id="277"/>
-    <w:bookmarkStart w:id="278" w:name="step-5-publish"/>
+    <w:bookmarkEnd w:id="278"/>
+    <w:bookmarkStart w:id="279" w:name="step-5-publish"/>
     <w:p>
       <w:pPr>
         <w:pStyle w:val="Heading4"/>
@@ -17715,9 +18915,9 @@
         </w:pict>
       </w:r>
     </w:p>
-    <w:bookmarkEnd w:id="278"/>
     <w:bookmarkEnd w:id="279"/>
-    <w:bookmarkStart w:id="280" w:name="structured-output-template-15"/>
+    <w:bookmarkEnd w:id="280"/>
+    <w:bookmarkStart w:id="281" w:name="structured-output-template-15"/>
     <w:p>
       <w:pPr>
         <w:pStyle w:val="Heading3"/>
@@ -17813,8 +19013,8 @@
         </w:pict>
       </w:r>
     </w:p>
-    <w:bookmarkEnd w:id="280"/>
-    <w:bookmarkStart w:id="282" w:name="output-integration-15"/>
+    <w:bookmarkEnd w:id="281"/>
+    <w:bookmarkStart w:id="283" w:name="output-integration-15"/>
     <w:p>
       <w:pPr>
         <w:pStyle w:val="Heading3"/>
@@ -17823,7 +19023,7 @@
         <w:t xml:space="preserve">Output Integration</w:t>
       </w:r>
     </w:p>
-    <w:bookmarkStart w:id="281" w:name="cross-skill-integration-15"/>
+    <w:bookmarkStart w:id="282" w:name="cross-skill-integration-15"/>
     <w:p>
       <w:pPr>
         <w:pStyle w:val="Heading4"/>
@@ -17901,9 +19101,9 @@
         </w:pict>
       </w:r>
     </w:p>
-    <w:bookmarkEnd w:id="281"/>
     <w:bookmarkEnd w:id="282"/>
-    <w:bookmarkStart w:id="283" w:name="output-quality-self-check-15"/>
+    <w:bookmarkEnd w:id="283"/>
+    <w:bookmarkStart w:id="284" w:name="output-quality-self-check-15"/>
     <w:p>
       <w:pPr>
         <w:pStyle w:val="Heading3"/>
@@ -18108,8 +19308,8 @@
         </w:pict>
       </w:r>
     </w:p>
-    <w:bookmarkEnd w:id="283"/>
-    <w:bookmarkStart w:id="284" w:name="related-skills-15"/>
+    <w:bookmarkEnd w:id="284"/>
+    <w:bookmarkStart w:id="285" w:name="related-skills-15"/>
     <w:p>
       <w:pPr>
         <w:pStyle w:val="Heading3"/>
@@ -18181,9 +19381,9 @@
         <w:t xml:space="preserve">- Log definitions</w:t>
       </w:r>
     </w:p>
-    <w:bookmarkEnd w:id="284"/>
     <w:bookmarkEnd w:id="285"/>
-    <w:bookmarkStart w:id="300" w:name="Xa8d843912066465379259c3c1109742205fd8f2"/>
+    <w:bookmarkEnd w:id="286"/>
+    <w:bookmarkStart w:id="301" w:name="Xa8d843912066465379259c3c1109742205fd8f2"/>
     <w:p>
       <w:pPr>
         <w:pStyle w:val="Heading2"/>
@@ -18192,7 +19392,7 @@
         <w:t xml:space="preserve">Playbook: Data Exploration (name: data-exploration)</w:t>
       </w:r>
     </w:p>
-    <w:bookmarkStart w:id="286" w:name="quick-start-16"/>
+    <w:bookmarkStart w:id="287" w:name="quick-start-16"/>
     <w:p>
       <w:pPr>
         <w:pStyle w:val="Heading3"/>
@@ -18357,8 +19557,8 @@
         <w:t xml:space="preserve">Diagnose</w:t>
       </w:r>
     </w:p>
-    <w:bookmarkEnd w:id="286"/>
-    <w:bookmarkStart w:id="288" w:name="step-1-diagnostic-questions-16"/>
+    <w:bookmarkEnd w:id="287"/>
+    <w:bookmarkStart w:id="289" w:name="step-1-diagnostic-questions-16"/>
     <w:p>
       <w:pPr>
         <w:pStyle w:val="Heading3"/>
@@ -18375,7 +19575,7 @@
         <w:t xml:space="preserve">Instead of a generic intake, I ask only what the files cannot answer:</w:t>
       </w:r>
     </w:p>
-    <w:bookmarkStart w:id="287" w:name="question-1-the-control-total"/>
+    <w:bookmarkStart w:id="288" w:name="question-1-the-control-total"/>
     <w:p>
       <w:pPr>
         <w:pStyle w:val="Heading4"/>
@@ -18411,9 +19611,9 @@
         </w:pict>
       </w:r>
     </w:p>
-    <w:bookmarkEnd w:id="287"/>
     <w:bookmarkEnd w:id="288"/>
-    <w:bookmarkStart w:id="294" w:name="the-process-16"/>
+    <w:bookmarkEnd w:id="289"/>
+    <w:bookmarkStart w:id="295" w:name="the-process-16"/>
     <w:p>
       <w:pPr>
         <w:pStyle w:val="Heading3"/>
@@ -18422,7 +19622,7 @@
         <w:t xml:space="preserve">The Process</w:t>
       </w:r>
     </w:p>
-    <w:bookmarkStart w:id="289" w:name="step-1-inventory"/>
+    <w:bookmarkStart w:id="290" w:name="step-1-inventory"/>
     <w:p>
       <w:pPr>
         <w:pStyle w:val="Heading4"/>
@@ -18439,8 +19639,8 @@
         <w:t xml:space="preserve">Rows, columns, period, keys, date received.</w:t>
       </w:r>
     </w:p>
-    <w:bookmarkEnd w:id="289"/>
-    <w:bookmarkStart w:id="290" w:name="step-2-profile"/>
+    <w:bookmarkEnd w:id="290"/>
+    <w:bookmarkStart w:id="291" w:name="step-2-profile"/>
     <w:p>
       <w:pPr>
         <w:pStyle w:val="Heading4"/>
@@ -18457,8 +19657,8 @@
         <w:t xml:space="preserve">Missing, duplicates, ranges, outliers per field.</w:t>
       </w:r>
     </w:p>
-    <w:bookmarkEnd w:id="290"/>
-    <w:bookmarkStart w:id="291" w:name="step-3-reconcile"/>
+    <w:bookmarkEnd w:id="291"/>
+    <w:bookmarkStart w:id="292" w:name="step-3-reconcile"/>
     <w:p>
       <w:pPr>
         <w:pStyle w:val="Heading4"/>
@@ -18475,8 +19675,8 @@
         <w:t xml:space="preserve">Sum to the reported figure; explain gaps.</w:t>
       </w:r>
     </w:p>
-    <w:bookmarkEnd w:id="291"/>
-    <w:bookmarkStart w:id="292" w:name="step-4-clean"/>
+    <w:bookmarkEnd w:id="292"/>
+    <w:bookmarkStart w:id="293" w:name="step-4-clean"/>
     <w:p>
       <w:pPr>
         <w:pStyle w:val="Heading4"/>
@@ -18493,8 +19693,8 @@
         <w:t xml:space="preserve">Rules logged one by one; never overwrite raw data.</w:t>
       </w:r>
     </w:p>
-    <w:bookmarkEnd w:id="292"/>
-    <w:bookmarkStart w:id="293" w:name="step-5-document"/>
+    <w:bookmarkEnd w:id="293"/>
+    <w:bookmarkStart w:id="294" w:name="step-5-document"/>
     <w:p>
       <w:pPr>
         <w:pStyle w:val="Heading4"/>
@@ -18518,9 +19718,9 @@
         </w:pict>
       </w:r>
     </w:p>
-    <w:bookmarkEnd w:id="293"/>
     <w:bookmarkEnd w:id="294"/>
-    <w:bookmarkStart w:id="295" w:name="structured-output-template-16"/>
+    <w:bookmarkEnd w:id="295"/>
+    <w:bookmarkStart w:id="296" w:name="structured-output-template-16"/>
     <w:p>
       <w:pPr>
         <w:pStyle w:val="Heading3"/>
@@ -18676,8 +19876,8 @@
         </w:pict>
       </w:r>
     </w:p>
-    <w:bookmarkEnd w:id="295"/>
-    <w:bookmarkStart w:id="297" w:name="output-integration-16"/>
+    <w:bookmarkEnd w:id="296"/>
+    <w:bookmarkStart w:id="298" w:name="output-integration-16"/>
     <w:p>
       <w:pPr>
         <w:pStyle w:val="Heading3"/>
@@ -18686,7 +19886,7 @@
         <w:t xml:space="preserve">Output Integration</w:t>
       </w:r>
     </w:p>
-    <w:bookmarkStart w:id="296" w:name="cross-skill-integration-16"/>
+    <w:bookmarkStart w:id="297" w:name="cross-skill-integration-16"/>
     <w:p>
       <w:pPr>
         <w:pStyle w:val="Heading4"/>
@@ -18758,9 +19958,9 @@
         </w:pict>
       </w:r>
     </w:p>
-    <w:bookmarkEnd w:id="296"/>
     <w:bookmarkEnd w:id="297"/>
-    <w:bookmarkStart w:id="298" w:name="output-quality-self-check-16"/>
+    <w:bookmarkEnd w:id="298"/>
+    <w:bookmarkStart w:id="299" w:name="output-quality-self-check-16"/>
     <w:p>
       <w:pPr>
         <w:pStyle w:val="Heading3"/>
@@ -18971,8 +20171,8 @@
         </w:pict>
       </w:r>
     </w:p>
-    <w:bookmarkEnd w:id="298"/>
-    <w:bookmarkStart w:id="299" w:name="related-skills-16"/>
+    <w:bookmarkEnd w:id="299"/>
+    <w:bookmarkStart w:id="300" w:name="related-skills-16"/>
     <w:p>
       <w:pPr>
         <w:pStyle w:val="Heading3"/>
@@ -19044,9 +20244,9 @@
         <w:t xml:space="preserve">- Find causes</w:t>
       </w:r>
     </w:p>
-    <w:bookmarkEnd w:id="299"/>
     <w:bookmarkEnd w:id="300"/>
-    <w:bookmarkStart w:id="317" w:name="Xc3cbc25cd734484ef4c6aac68e31b546a79f639"/>
+    <w:bookmarkEnd w:id="301"/>
+    <w:bookmarkStart w:id="318" w:name="Xc3cbc25cd734484ef4c6aac68e31b546a79f639"/>
     <w:p>
       <w:pPr>
         <w:pStyle w:val="Heading2"/>
@@ -19055,7 +20255,7 @@
         <w:t xml:space="preserve">Playbook: Market Sizing (name: market-sizing)</w:t>
       </w:r>
     </w:p>
-    <w:bookmarkStart w:id="301" w:name="quick-start-17"/>
+    <w:bookmarkStart w:id="302" w:name="quick-start-17"/>
     <w:p>
       <w:pPr>
         <w:pStyle w:val="Heading3"/>
@@ -19232,8 +20432,8 @@
         <w:t xml:space="preserve">Diagnose and Develop</w:t>
       </w:r>
     </w:p>
-    <w:bookmarkEnd w:id="301"/>
-    <w:bookmarkStart w:id="304" w:name="step-1-diagnostic-questions-17"/>
+    <w:bookmarkEnd w:id="302"/>
+    <w:bookmarkStart w:id="305" w:name="step-1-diagnostic-questions-17"/>
     <w:p>
       <w:pPr>
         <w:pStyle w:val="Heading3"/>
@@ -19250,7 +20450,7 @@
         <w:t xml:space="preserve">Instead of a generic intake, I ask only what the files cannot answer:</w:t>
       </w:r>
     </w:p>
-    <w:bookmarkStart w:id="302" w:name="question-1-the-boundary"/>
+    <w:bookmarkStart w:id="303" w:name="question-1-the-boundary"/>
     <w:p>
       <w:pPr>
         <w:pStyle w:val="Heading4"/>
@@ -19279,8 +20479,8 @@
         <w:t xml:space="preserve">Boundary choices change the answer more than math does.</w:t>
       </w:r>
     </w:p>
-    <w:bookmarkEnd w:id="302"/>
-    <w:bookmarkStart w:id="303" w:name="question-2-the-decision"/>
+    <w:bookmarkEnd w:id="303"/>
+    <w:bookmarkStart w:id="304" w:name="question-2-the-decision"/>
     <w:p>
       <w:pPr>
         <w:pStyle w:val="Heading4"/>
@@ -19316,9 +20516,9 @@
         </w:pict>
       </w:r>
     </w:p>
-    <w:bookmarkEnd w:id="303"/>
     <w:bookmarkEnd w:id="304"/>
-    <w:bookmarkStart w:id="310" w:name="the-process-17"/>
+    <w:bookmarkEnd w:id="305"/>
+    <w:bookmarkStart w:id="311" w:name="the-process-17"/>
     <w:p>
       <w:pPr>
         <w:pStyle w:val="Heading3"/>
@@ -19327,7 +20527,7 @@
         <w:t xml:space="preserve">The Process</w:t>
       </w:r>
     </w:p>
-    <w:bookmarkStart w:id="305" w:name="step-1-define-the-market"/>
+    <w:bookmarkStart w:id="306" w:name="step-1-define-the-market"/>
     <w:p>
       <w:pPr>
         <w:pStyle w:val="Heading4"/>
@@ -19344,8 +20544,8 @@
         <w:t xml:space="preserve">Product, geography, segment, year, currency.</w:t>
       </w:r>
     </w:p>
-    <w:bookmarkEnd w:id="305"/>
-    <w:bookmarkStart w:id="306" w:name="step-2-top-down"/>
+    <w:bookmarkEnd w:id="306"/>
+    <w:bookmarkStart w:id="307" w:name="step-2-top-down"/>
     <w:p>
       <w:pPr>
         <w:pStyle w:val="Heading4"/>
@@ -19362,8 +20562,8 @@
         <w:t xml:space="preserve">Start from a published total and narrow by segment, share, and relevance.</w:t>
       </w:r>
     </w:p>
-    <w:bookmarkEnd w:id="306"/>
-    <w:bookmarkStart w:id="307" w:name="step-3-bottom-up"/>
+    <w:bookmarkEnd w:id="307"/>
+    <w:bookmarkStart w:id="308" w:name="step-3-bottom-up"/>
     <w:p>
       <w:pPr>
         <w:pStyle w:val="Heading4"/>
@@ -19380,8 +20580,8 @@
         <w:t xml:space="preserve">Units x price x frequency x customers; use client data where possible.</w:t>
       </w:r>
     </w:p>
-    <w:bookmarkEnd w:id="307"/>
-    <w:bookmarkStart w:id="308" w:name="step-4-reconcile"/>
+    <w:bookmarkEnd w:id="308"/>
+    <w:bookmarkStart w:id="309" w:name="step-4-reconcile"/>
     <w:p>
       <w:pPr>
         <w:pStyle w:val="Heading4"/>
@@ -19398,8 +20598,8 @@
         <w:t xml:space="preserve">Explain gaps over 20%; choose a base and a range.</w:t>
       </w:r>
     </w:p>
-    <w:bookmarkEnd w:id="308"/>
-    <w:bookmarkStart w:id="309" w:name="step-5-stress-the-drivers"/>
+    <w:bookmarkEnd w:id="309"/>
+    <w:bookmarkStart w:id="310" w:name="step-5-stress-the-drivers"/>
     <w:p>
       <w:pPr>
         <w:pStyle w:val="Heading4"/>
@@ -19423,9 +20623,9 @@
         </w:pict>
       </w:r>
     </w:p>
-    <w:bookmarkEnd w:id="309"/>
     <w:bookmarkEnd w:id="310"/>
-    <w:bookmarkStart w:id="311" w:name="common-mistakes-4"/>
+    <w:bookmarkEnd w:id="311"/>
+    <w:bookmarkStart w:id="312" w:name="common-mistakes-4"/>
     <w:p>
       <w:pPr>
         <w:pStyle w:val="Heading3"/>
@@ -19479,8 +20679,8 @@
         </w:pict>
       </w:r>
     </w:p>
-    <w:bookmarkEnd w:id="311"/>
-    <w:bookmarkStart w:id="312" w:name="structured-output-template-17"/>
+    <w:bookmarkEnd w:id="312"/>
+    <w:bookmarkStart w:id="313" w:name="structured-output-template-17"/>
     <w:p>
       <w:pPr>
         <w:pStyle w:val="Heading3"/>
@@ -19693,8 +20893,8 @@
         </w:pict>
       </w:r>
     </w:p>
-    <w:bookmarkEnd w:id="312"/>
-    <w:bookmarkStart w:id="314" w:name="output-integration-17"/>
+    <w:bookmarkEnd w:id="313"/>
+    <w:bookmarkStart w:id="315" w:name="output-integration-17"/>
     <w:p>
       <w:pPr>
         <w:pStyle w:val="Heading3"/>
@@ -19703,7 +20903,7 @@
         <w:t xml:space="preserve">Output Integration</w:t>
       </w:r>
     </w:p>
-    <w:bookmarkStart w:id="313" w:name="cross-skill-integration-17"/>
+    <w:bookmarkStart w:id="314" w:name="cross-skill-integration-17"/>
     <w:p>
       <w:pPr>
         <w:pStyle w:val="Heading4"/>
@@ -19781,9 +20981,9 @@
         </w:pict>
       </w:r>
     </w:p>
-    <w:bookmarkEnd w:id="313"/>
     <w:bookmarkEnd w:id="314"/>
-    <w:bookmarkStart w:id="315" w:name="output-quality-self-check-17"/>
+    <w:bookmarkEnd w:id="315"/>
+    <w:bookmarkStart w:id="316" w:name="output-quality-self-check-17"/>
     <w:p>
       <w:pPr>
         <w:pStyle w:val="Heading3"/>
@@ -20022,8 +21222,8 @@
         </w:pict>
       </w:r>
     </w:p>
-    <w:bookmarkEnd w:id="315"/>
-    <w:bookmarkStart w:id="316" w:name="related-skills-17"/>
+    <w:bookmarkEnd w:id="316"/>
+    <w:bookmarkStart w:id="317" w:name="related-skills-17"/>
     <w:p>
       <w:pPr>
         <w:pStyle w:val="Heading3"/>
@@ -20095,9 +21295,9 @@
         <w:t xml:space="preserve">- Plan the model</w:t>
       </w:r>
     </w:p>
-    <w:bookmarkEnd w:id="316"/>
     <w:bookmarkEnd w:id="317"/>
-    <w:bookmarkStart w:id="333" w:name="Xc4164740584937937c80eab56c12f7357066eda"/>
+    <w:bookmarkEnd w:id="318"/>
+    <w:bookmarkStart w:id="334" w:name="Xc4164740584937937c80eab56c12f7357066eda"/>
     <w:p>
       <w:pPr>
         <w:pStyle w:val="Heading2"/>
@@ -20106,7 +21306,7 @@
         <w:t xml:space="preserve">Playbook: Benchmark Analysis (name: benchmark-analysis)</w:t>
       </w:r>
     </w:p>
-    <w:bookmarkStart w:id="318" w:name="quick-start-18"/>
+    <w:bookmarkStart w:id="319" w:name="quick-start-18"/>
     <w:p>
       <w:pPr>
         <w:pStyle w:val="Heading3"/>
@@ -20283,8 +21483,8 @@
         <w:t xml:space="preserve">Diagnose</w:t>
       </w:r>
     </w:p>
-    <w:bookmarkEnd w:id="318"/>
-    <w:bookmarkStart w:id="321" w:name="step-1-diagnostic-questions-18"/>
+    <w:bookmarkEnd w:id="319"/>
+    <w:bookmarkStart w:id="322" w:name="step-1-diagnostic-questions-18"/>
     <w:p>
       <w:pPr>
         <w:pStyle w:val="Heading3"/>
@@ -20301,7 +21501,7 @@
         <w:t xml:space="preserve">Instead of a generic intake, I ask only what the files cannot answer:</w:t>
       </w:r>
     </w:p>
-    <w:bookmarkStart w:id="319" w:name="question-1-the-peer-set"/>
+    <w:bookmarkStart w:id="320" w:name="question-1-the-peer-set"/>
     <w:p>
       <w:pPr>
         <w:pStyle w:val="Heading4"/>
@@ -20330,8 +21530,8 @@
         <w:t xml:space="preserve">A benchmark the sponsor rejects will not drive action.</w:t>
       </w:r>
     </w:p>
-    <w:bookmarkEnd w:id="319"/>
-    <w:bookmarkStart w:id="320" w:name="question-2-the-definition"/>
+    <w:bookmarkEnd w:id="320"/>
+    <w:bookmarkStart w:id="321" w:name="question-2-the-definition"/>
     <w:p>
       <w:pPr>
         <w:pStyle w:val="Heading4"/>
@@ -20367,9 +21567,9 @@
         </w:pict>
       </w:r>
     </w:p>
-    <w:bookmarkEnd w:id="320"/>
     <w:bookmarkEnd w:id="321"/>
-    <w:bookmarkStart w:id="327" w:name="the-process-18"/>
+    <w:bookmarkEnd w:id="322"/>
+    <w:bookmarkStart w:id="328" w:name="the-process-18"/>
     <w:p>
       <w:pPr>
         <w:pStyle w:val="Heading3"/>
@@ -20378,7 +21578,7 @@
         <w:t xml:space="preserve">The Process</w:t>
       </w:r>
     </w:p>
-    <w:bookmarkStart w:id="322" w:name="step-1-choose-metrics-and-peers"/>
+    <w:bookmarkStart w:id="323" w:name="step-1-choose-metrics-and-peers"/>
     <w:p>
       <w:pPr>
         <w:pStyle w:val="Heading4"/>
@@ -20395,8 +21595,8 @@
         <w:t xml:space="preserve">Limit to metrics that connect to the key question.</w:t>
       </w:r>
     </w:p>
-    <w:bookmarkEnd w:id="322"/>
-    <w:bookmarkStart w:id="323" w:name="step-2-normalize"/>
+    <w:bookmarkEnd w:id="323"/>
+    <w:bookmarkStart w:id="324" w:name="step-2-normalize"/>
     <w:p>
       <w:pPr>
         <w:pStyle w:val="Heading4"/>
@@ -20413,8 +21613,8 @@
         <w:t xml:space="preserve">Align period, currency, scope, and definition; log adjustments.</w:t>
       </w:r>
     </w:p>
-    <w:bookmarkEnd w:id="323"/>
-    <w:bookmarkStart w:id="324" w:name="step-3-compare"/>
+    <w:bookmarkEnd w:id="324"/>
+    <w:bookmarkStart w:id="325" w:name="step-3-compare"/>
     <w:p>
       <w:pPr>
         <w:pStyle w:val="Heading4"/>
@@ -20431,8 +21631,8 @@
         <w:t xml:space="preserve">Median, quartiles, best-in-class; show client position.</w:t>
       </w:r>
     </w:p>
-    <w:bookmarkEnd w:id="324"/>
-    <w:bookmarkStart w:id="325" w:name="step-4-size-the-gap"/>
+    <w:bookmarkEnd w:id="325"/>
+    <w:bookmarkStart w:id="326" w:name="step-4-size-the-gap"/>
     <w:p>
       <w:pPr>
         <w:pStyle w:val="Heading4"/>
@@ -20449,8 +21649,8 @@
         <w:t xml:space="preserve">Gap x client base = value if closed; show a haircut.</w:t>
       </w:r>
     </w:p>
-    <w:bookmarkEnd w:id="325"/>
-    <w:bookmarkStart w:id="326" w:name="step-5-caveat"/>
+    <w:bookmarkEnd w:id="326"/>
+    <w:bookmarkStart w:id="327" w:name="step-5-caveat"/>
     <w:p>
       <w:pPr>
         <w:pStyle w:val="Heading4"/>
@@ -20474,9 +21674,9 @@
         </w:pict>
       </w:r>
     </w:p>
-    <w:bookmarkEnd w:id="326"/>
     <w:bookmarkEnd w:id="327"/>
-    <w:bookmarkStart w:id="328" w:name="structured-output-template-18"/>
+    <w:bookmarkEnd w:id="328"/>
+    <w:bookmarkStart w:id="329" w:name="structured-output-template-18"/>
     <w:p>
       <w:pPr>
         <w:pStyle w:val="Heading3"/>
@@ -20647,8 +21847,8 @@
         </w:pict>
       </w:r>
     </w:p>
-    <w:bookmarkEnd w:id="328"/>
-    <w:bookmarkStart w:id="330" w:name="output-integration-18"/>
+    <w:bookmarkEnd w:id="329"/>
+    <w:bookmarkStart w:id="331" w:name="output-integration-18"/>
     <w:p>
       <w:pPr>
         <w:pStyle w:val="Heading3"/>
@@ -20657,7 +21857,7 @@
         <w:t xml:space="preserve">Output Integration</w:t>
       </w:r>
     </w:p>
-    <w:bookmarkStart w:id="329" w:name="cross-skill-integration-18"/>
+    <w:bookmarkStart w:id="330" w:name="cross-skill-integration-18"/>
     <w:p>
       <w:pPr>
         <w:pStyle w:val="Heading4"/>
@@ -20735,9 +21935,9 @@
         </w:pict>
       </w:r>
     </w:p>
-    <w:bookmarkEnd w:id="329"/>
     <w:bookmarkEnd w:id="330"/>
-    <w:bookmarkStart w:id="331" w:name="output-quality-self-check-18"/>
+    <w:bookmarkEnd w:id="331"/>
+    <w:bookmarkStart w:id="332" w:name="output-quality-self-check-18"/>
     <w:p>
       <w:pPr>
         <w:pStyle w:val="Heading3"/>
@@ -20976,8 +22176,8 @@
         </w:pict>
       </w:r>
     </w:p>
-    <w:bookmarkEnd w:id="331"/>
-    <w:bookmarkStart w:id="332" w:name="related-skills-18"/>
+    <w:bookmarkEnd w:id="332"/>
+    <w:bookmarkStart w:id="333" w:name="related-skills-18"/>
     <w:p>
       <w:pPr>
         <w:pStyle w:val="Heading3"/>
@@ -21049,9 +22249,9 @@
         <w:t xml:space="preserve">- Make the chart</w:t>
       </w:r>
     </w:p>
-    <w:bookmarkEnd w:id="332"/>
     <w:bookmarkEnd w:id="333"/>
-    <w:bookmarkStart w:id="349" w:name="Xfbdb51fc4f164ad21d0f30a1376b4fa2ac0cd02"/>
+    <w:bookmarkEnd w:id="334"/>
+    <w:bookmarkStart w:id="350" w:name="Xfbdb51fc4f164ad21d0f30a1376b4fa2ac0cd02"/>
     <w:p>
       <w:pPr>
         <w:pStyle w:val="Heading2"/>
@@ -21060,7 +22260,7 @@
         <w:t xml:space="preserve">Playbook: Competitive Landscape (name: competitive-landscape)</w:t>
       </w:r>
     </w:p>
-    <w:bookmarkStart w:id="334" w:name="quick-start-19"/>
+    <w:bookmarkStart w:id="335" w:name="quick-start-19"/>
     <w:p>
       <w:pPr>
         <w:pStyle w:val="Heading3"/>
@@ -21231,8 +22431,8 @@
         <w:t xml:space="preserve">Diagnose</w:t>
       </w:r>
     </w:p>
-    <w:bookmarkEnd w:id="334"/>
-    <w:bookmarkStart w:id="337" w:name="step-1-diagnostic-questions-19"/>
+    <w:bookmarkEnd w:id="335"/>
+    <w:bookmarkStart w:id="338" w:name="step-1-diagnostic-questions-19"/>
     <w:p>
       <w:pPr>
         <w:pStyle w:val="Heading3"/>
@@ -21249,7 +22449,7 @@
         <w:t xml:space="preserve">Instead of a generic intake, I ask only what the files cannot answer:</w:t>
       </w:r>
     </w:p>
-    <w:bookmarkStart w:id="335" w:name="question-1-the-decision-4"/>
+    <w:bookmarkStart w:id="336" w:name="question-1-the-decision-3"/>
     <w:p>
       <w:pPr>
         <w:pStyle w:val="Heading4"/>
@@ -21278,8 +22478,8 @@
         <w:t xml:space="preserve">Scope the landscape to what drives a decision.</w:t>
       </w:r>
     </w:p>
-    <w:bookmarkEnd w:id="335"/>
-    <w:bookmarkStart w:id="336" w:name="question-2-the-axes"/>
+    <w:bookmarkEnd w:id="336"/>
+    <w:bookmarkStart w:id="337" w:name="question-2-the-axes"/>
     <w:p>
       <w:pPr>
         <w:pStyle w:val="Heading4"/>
@@ -21315,9 +22515,9 @@
         </w:pict>
       </w:r>
     </w:p>
-    <w:bookmarkEnd w:id="336"/>
     <w:bookmarkEnd w:id="337"/>
-    <w:bookmarkStart w:id="343" w:name="the-process-19"/>
+    <w:bookmarkEnd w:id="338"/>
+    <w:bookmarkStart w:id="344" w:name="the-process-19"/>
     <w:p>
       <w:pPr>
         <w:pStyle w:val="Heading3"/>
@@ -21326,7 +22526,7 @@
         <w:t xml:space="preserve">The Process</w:t>
       </w:r>
     </w:p>
-    <w:bookmarkStart w:id="338" w:name="step-1-define-the-field"/>
+    <w:bookmarkStart w:id="339" w:name="step-1-define-the-field"/>
     <w:p>
       <w:pPr>
         <w:pStyle w:val="Heading4"/>
@@ -21343,8 +22543,8 @@
         <w:t xml:space="preserve">Direct, indirect, new entrants, substitutes.</w:t>
       </w:r>
     </w:p>
-    <w:bookmarkEnd w:id="338"/>
-    <w:bookmarkStart w:id="339" w:name="step-2-profile-each"/>
+    <w:bookmarkEnd w:id="339"/>
+    <w:bookmarkStart w:id="340" w:name="step-2-profile-each"/>
     <w:p>
       <w:pPr>
         <w:pStyle w:val="Heading4"/>
@@ -21361,8 +22561,8 @@
         <w:t xml:space="preserve">Offer, price, scale, strengths, moves, evidence.</w:t>
       </w:r>
     </w:p>
-    <w:bookmarkEnd w:id="339"/>
-    <w:bookmarkStart w:id="340" w:name="step-3-map-positioning"/>
+    <w:bookmarkEnd w:id="340"/>
+    <w:bookmarkStart w:id="341" w:name="step-3-map-positioning"/>
     <w:p>
       <w:pPr>
         <w:pStyle w:val="Heading4"/>
@@ -21379,8 +22579,8 @@
         <w:t xml:space="preserve">Two axes chosen from customer evidence.</w:t>
       </w:r>
     </w:p>
-    <w:bookmarkEnd w:id="340"/>
-    <w:bookmarkStart w:id="341" w:name="step-4-draw-implications"/>
+    <w:bookmarkEnd w:id="341"/>
+    <w:bookmarkStart w:id="342" w:name="step-4-draw-implications"/>
     <w:p>
       <w:pPr>
         <w:pStyle w:val="Heading4"/>
@@ -21397,8 +22597,8 @@
         <w:t xml:space="preserve">Where the client wins, loses, and what moves are likely.</w:t>
       </w:r>
     </w:p>
-    <w:bookmarkEnd w:id="341"/>
-    <w:bookmarkStart w:id="342" w:name="step-5-list-gaps"/>
+    <w:bookmarkEnd w:id="342"/>
+    <w:bookmarkStart w:id="343" w:name="step-5-list-gaps"/>
     <w:p>
       <w:pPr>
         <w:pStyle w:val="Heading4"/>
@@ -21422,9 +22622,9 @@
         </w:pict>
       </w:r>
     </w:p>
-    <w:bookmarkEnd w:id="342"/>
     <w:bookmarkEnd w:id="343"/>
-    <w:bookmarkStart w:id="344" w:name="structured-output-template-19"/>
+    <w:bookmarkEnd w:id="344"/>
+    <w:bookmarkStart w:id="345" w:name="structured-output-template-19"/>
     <w:p>
       <w:pPr>
         <w:pStyle w:val="Heading3"/>
@@ -21589,8 +22789,8 @@
         </w:pict>
       </w:r>
     </w:p>
-    <w:bookmarkEnd w:id="344"/>
-    <w:bookmarkStart w:id="346" w:name="output-integration-19"/>
+    <w:bookmarkEnd w:id="345"/>
+    <w:bookmarkStart w:id="347" w:name="output-integration-19"/>
     <w:p>
       <w:pPr>
         <w:pStyle w:val="Heading3"/>
@@ -21599,7 +22799,7 @@
         <w:t xml:space="preserve">Output Integration</w:t>
       </w:r>
     </w:p>
-    <w:bookmarkStart w:id="345" w:name="cross-skill-integration-19"/>
+    <w:bookmarkStart w:id="346" w:name="cross-skill-integration-19"/>
     <w:p>
       <w:pPr>
         <w:pStyle w:val="Heading4"/>
@@ -21677,9 +22877,9 @@
         </w:pict>
       </w:r>
     </w:p>
-    <w:bookmarkEnd w:id="345"/>
     <w:bookmarkEnd w:id="346"/>
-    <w:bookmarkStart w:id="347" w:name="output-quality-self-check-19"/>
+    <w:bookmarkEnd w:id="347"/>
+    <w:bookmarkStart w:id="348" w:name="output-quality-self-check-19"/>
     <w:p>
       <w:pPr>
         <w:pStyle w:val="Heading3"/>
@@ -21890,8 +23090,8 @@
         </w:pict>
       </w:r>
     </w:p>
-    <w:bookmarkEnd w:id="347"/>
-    <w:bookmarkStart w:id="348" w:name="related-skills-19"/>
+    <w:bookmarkEnd w:id="348"/>
+    <w:bookmarkStart w:id="349" w:name="related-skills-19"/>
     <w:p>
       <w:pPr>
         <w:pStyle w:val="Heading3"/>
@@ -21963,9 +23163,9 @@
         <w:t xml:space="preserve">- Visualize</w:t>
       </w:r>
     </w:p>
-    <w:bookmarkEnd w:id="348"/>
     <w:bookmarkEnd w:id="349"/>
-    <w:bookmarkStart w:id="364" w:name="X40a929a877eb72d404965aca44093ea667c9bcf"/>
+    <w:bookmarkEnd w:id="350"/>
+    <w:bookmarkStart w:id="365" w:name="X40a929a877eb72d404965aca44093ea667c9bcf"/>
     <w:p>
       <w:pPr>
         <w:pStyle w:val="Heading2"/>
@@ -21974,7 +23174,7 @@
         <w:t xml:space="preserve">Playbook: Value Driver Tree (name: value-driver-tree)</w:t>
       </w:r>
     </w:p>
-    <w:bookmarkStart w:id="350" w:name="quick-start-20"/>
+    <w:bookmarkStart w:id="351" w:name="quick-start-20"/>
     <w:p>
       <w:pPr>
         <w:pStyle w:val="Heading3"/>
@@ -22139,8 +23339,8 @@
         <w:t xml:space="preserve">Diagnose and Develop</w:t>
       </w:r>
     </w:p>
-    <w:bookmarkEnd w:id="350"/>
-    <w:bookmarkStart w:id="352" w:name="step-1-diagnostic-questions-20"/>
+    <w:bookmarkEnd w:id="351"/>
+    <w:bookmarkStart w:id="353" w:name="step-1-diagnostic-questions-20"/>
     <w:p>
       <w:pPr>
         <w:pStyle w:val="Heading3"/>
@@ -22157,7 +23357,7 @@
         <w:t xml:space="preserve">Instead of a generic intake, I ask only what the files cannot answer:</w:t>
       </w:r>
     </w:p>
-    <w:bookmarkStart w:id="351" w:name="question-1-the-outcome"/>
+    <w:bookmarkStart w:id="352" w:name="question-1-the-outcome"/>
     <w:p>
       <w:pPr>
         <w:pStyle w:val="Heading4"/>
@@ -22193,9 +23393,9 @@
         </w:pict>
       </w:r>
     </w:p>
-    <w:bookmarkEnd w:id="351"/>
     <w:bookmarkEnd w:id="352"/>
-    <w:bookmarkStart w:id="358" w:name="the-process-20"/>
+    <w:bookmarkEnd w:id="353"/>
+    <w:bookmarkStart w:id="359" w:name="the-process-20"/>
     <w:p>
       <w:pPr>
         <w:pStyle w:val="Heading3"/>
@@ -22204,7 +23404,7 @@
         <w:t xml:space="preserve">The Process</w:t>
       </w:r>
     </w:p>
-    <w:bookmarkStart w:id="353" w:name="step-1-state-the-outcome"/>
+    <w:bookmarkStart w:id="354" w:name="step-1-state-the-outcome"/>
     <w:p>
       <w:pPr>
         <w:pStyle w:val="Heading4"/>
@@ -22221,8 +23421,8 @@
         <w:t xml:space="preserve">Pick one metric and its baseline.</w:t>
       </w:r>
     </w:p>
-    <w:bookmarkEnd w:id="353"/>
-    <w:bookmarkStart w:id="354" w:name="step-2-decompose"/>
+    <w:bookmarkEnd w:id="354"/>
+    <w:bookmarkStart w:id="355" w:name="step-2-decompose"/>
     <w:p>
       <w:pPr>
         <w:pStyle w:val="Heading4"/>
@@ -22239,8 +23439,8 @@
         <w:t xml:space="preserve">Revenue = volume x price x mix; cost by fixed/variable and by activity.</w:t>
       </w:r>
     </w:p>
-    <w:bookmarkEnd w:id="354"/>
-    <w:bookmarkStart w:id="355" w:name="step-3-attach-values"/>
+    <w:bookmarkEnd w:id="355"/>
+    <w:bookmarkStart w:id="356" w:name="step-3-attach-values"/>
     <w:p>
       <w:pPr>
         <w:pStyle w:val="Heading4"/>
@@ -22257,8 +23457,8 @@
         <w:t xml:space="preserve">Baseline per leaf; mark source and quality.</w:t>
       </w:r>
     </w:p>
-    <w:bookmarkEnd w:id="355"/>
-    <w:bookmarkStart w:id="356" w:name="step-4-rate-each-driver"/>
+    <w:bookmarkEnd w:id="356"/>
+    <w:bookmarkStart w:id="357" w:name="step-4-rate-each-driver"/>
     <w:p>
       <w:pPr>
         <w:pStyle w:val="Heading4"/>
@@ -22275,8 +23475,8 @@
         <w:t xml:space="preserve">Controllable? Sensitivity? Evidence for a lever?</w:t>
       </w:r>
     </w:p>
-    <w:bookmarkEnd w:id="356"/>
-    <w:bookmarkStart w:id="357" w:name="step-5-rank"/>
+    <w:bookmarkEnd w:id="357"/>
+    <w:bookmarkStart w:id="358" w:name="step-5-rank"/>
     <w:p>
       <w:pPr>
         <w:pStyle w:val="Heading4"/>
@@ -22300,9 +23500,9 @@
         </w:pict>
       </w:r>
     </w:p>
-    <w:bookmarkEnd w:id="357"/>
     <w:bookmarkEnd w:id="358"/>
-    <w:bookmarkStart w:id="359" w:name="structured-output-template-20"/>
+    <w:bookmarkEnd w:id="359"/>
+    <w:bookmarkStart w:id="360" w:name="structured-output-template-20"/>
     <w:p>
       <w:pPr>
         <w:pStyle w:val="Heading3"/>
@@ -22414,8 +23614,8 @@
         </w:pict>
       </w:r>
     </w:p>
-    <w:bookmarkEnd w:id="359"/>
-    <w:bookmarkStart w:id="361" w:name="output-integration-20"/>
+    <w:bookmarkEnd w:id="360"/>
+    <w:bookmarkStart w:id="362" w:name="output-integration-20"/>
     <w:p>
       <w:pPr>
         <w:pStyle w:val="Heading3"/>
@@ -22424,7 +23624,7 @@
         <w:t xml:space="preserve">Output Integration</w:t>
       </w:r>
     </w:p>
-    <w:bookmarkStart w:id="360" w:name="cross-skill-integration-20"/>
+    <w:bookmarkStart w:id="361" w:name="cross-skill-integration-20"/>
     <w:p>
       <w:pPr>
         <w:pStyle w:val="Heading4"/>
@@ -22502,9 +23702,9 @@
         </w:pict>
       </w:r>
     </w:p>
-    <w:bookmarkEnd w:id="360"/>
     <w:bookmarkEnd w:id="361"/>
-    <w:bookmarkStart w:id="362" w:name="output-quality-self-check-20"/>
+    <w:bookmarkEnd w:id="362"/>
+    <w:bookmarkStart w:id="363" w:name="output-quality-self-check-20"/>
     <w:p>
       <w:pPr>
         <w:pStyle w:val="Heading3"/>
@@ -22715,8 +23915,8 @@
         </w:pict>
       </w:r>
     </w:p>
-    <w:bookmarkEnd w:id="362"/>
-    <w:bookmarkStart w:id="363" w:name="related-skills-20"/>
+    <w:bookmarkEnd w:id="363"/>
+    <w:bookmarkStart w:id="364" w:name="related-skills-20"/>
     <w:p>
       <w:pPr>
         <w:pStyle w:val="Heading3"/>
@@ -22788,9 +23988,9 @@
         <w:t xml:space="preserve">- Target values</w:t>
       </w:r>
     </w:p>
-    <w:bookmarkEnd w:id="363"/>
     <w:bookmarkEnd w:id="364"/>
-    <w:bookmarkStart w:id="379" w:name="X53a5885ba880cbc6b30a58536e3cd773b8188fc"/>
+    <w:bookmarkEnd w:id="365"/>
+    <w:bookmarkStart w:id="380" w:name="X53a5885ba880cbc6b30a58536e3cd773b8188fc"/>
     <w:p>
       <w:pPr>
         <w:pStyle w:val="Heading2"/>
@@ -22799,7 +23999,7 @@
         <w:t xml:space="preserve">Playbook: Root Cause Analysis (name: root-cause-analysis)</w:t>
       </w:r>
     </w:p>
-    <w:bookmarkStart w:id="365" w:name="quick-start-21"/>
+    <w:bookmarkStart w:id="366" w:name="quick-start-21"/>
     <w:p>
       <w:pPr>
         <w:pStyle w:val="Heading3"/>
@@ -22970,8 +24170,8 @@
         <w:t xml:space="preserve">Diagnose</w:t>
       </w:r>
     </w:p>
-    <w:bookmarkEnd w:id="365"/>
-    <w:bookmarkStart w:id="367" w:name="step-1-diagnostic-questions-21"/>
+    <w:bookmarkEnd w:id="366"/>
+    <w:bookmarkStart w:id="368" w:name="step-1-diagnostic-questions-21"/>
     <w:p>
       <w:pPr>
         <w:pStyle w:val="Heading3"/>
@@ -22988,7 +24188,7 @@
         <w:t xml:space="preserve">Instead of a generic intake, I ask only what the files cannot answer:</w:t>
       </w:r>
     </w:p>
-    <w:bookmarkStart w:id="366" w:name="question-1-the-split"/>
+    <w:bookmarkStart w:id="367" w:name="question-1-the-split"/>
     <w:p>
       <w:pPr>
         <w:pStyle w:val="Heading4"/>
@@ -23024,9 +24224,9 @@
         </w:pict>
       </w:r>
     </w:p>
-    <w:bookmarkEnd w:id="366"/>
     <w:bookmarkEnd w:id="367"/>
-    <w:bookmarkStart w:id="373" w:name="the-process-21"/>
+    <w:bookmarkEnd w:id="368"/>
+    <w:bookmarkStart w:id="374" w:name="the-process-21"/>
     <w:p>
       <w:pPr>
         <w:pStyle w:val="Heading3"/>
@@ -23035,7 +24235,7 @@
         <w:t xml:space="preserve">The Process</w:t>
       </w:r>
     </w:p>
-    <w:bookmarkStart w:id="368" w:name="step-1-quantify-the-gap"/>
+    <w:bookmarkStart w:id="369" w:name="step-1-quantify-the-gap"/>
     <w:p>
       <w:pPr>
         <w:pStyle w:val="Heading4"/>
@@ -23052,8 +24252,8 @@
         <w:t xml:space="preserve">Size, trend, and where it is largest.</w:t>
       </w:r>
     </w:p>
-    <w:bookmarkEnd w:id="368"/>
-    <w:bookmarkStart w:id="369" w:name="step-2-split-by-dimension"/>
+    <w:bookmarkEnd w:id="369"/>
+    <w:bookmarkStart w:id="370" w:name="step-2-split-by-dimension"/>
     <w:p>
       <w:pPr>
         <w:pStyle w:val="Heading4"/>
@@ -23070,8 +24270,8 @@
         <w:t xml:space="preserve">Pareto the gap by segment, time, product, region.</w:t>
       </w:r>
     </w:p>
-    <w:bookmarkEnd w:id="369"/>
-    <w:bookmarkStart w:id="370" w:name="step-3-list-cause-hypotheses"/>
+    <w:bookmarkEnd w:id="370"/>
+    <w:bookmarkStart w:id="371" w:name="step-3-list-cause-hypotheses"/>
     <w:p>
       <w:pPr>
         <w:pStyle w:val="Heading4"/>
@@ -23088,8 +24288,8 @@
         <w:t xml:space="preserve">Structured by driver tree.</w:t>
       </w:r>
     </w:p>
-    <w:bookmarkEnd w:id="370"/>
-    <w:bookmarkStart w:id="371" w:name="step-4-test-each"/>
+    <w:bookmarkEnd w:id="371"/>
+    <w:bookmarkStart w:id="372" w:name="step-4-test-each"/>
     <w:p>
       <w:pPr>
         <w:pStyle w:val="Heading4"/>
@@ -23106,8 +24306,8 @@
         <w:t xml:space="preserve">With data or field evidence; record result.</w:t>
       </w:r>
     </w:p>
-    <w:bookmarkEnd w:id="371"/>
-    <w:bookmarkStart w:id="372" w:name="step-5-rank-root-causes"/>
+    <w:bookmarkEnd w:id="372"/>
+    <w:bookmarkStart w:id="373" w:name="step-5-rank-root-causes"/>
     <w:p>
       <w:pPr>
         <w:pStyle w:val="Heading4"/>
@@ -23131,9 +24331,9 @@
         </w:pict>
       </w:r>
     </w:p>
-    <w:bookmarkEnd w:id="372"/>
     <w:bookmarkEnd w:id="373"/>
-    <w:bookmarkStart w:id="374" w:name="structured-output-template-21"/>
+    <w:bookmarkEnd w:id="374"/>
+    <w:bookmarkStart w:id="375" w:name="structured-output-template-21"/>
     <w:p>
       <w:pPr>
         <w:pStyle w:val="Heading3"/>
@@ -23301,8 +24501,8 @@
         </w:pict>
       </w:r>
     </w:p>
-    <w:bookmarkEnd w:id="374"/>
-    <w:bookmarkStart w:id="376" w:name="output-integration-21"/>
+    <w:bookmarkEnd w:id="375"/>
+    <w:bookmarkStart w:id="377" w:name="output-integration-21"/>
     <w:p>
       <w:pPr>
         <w:pStyle w:val="Heading3"/>
@@ -23311,7 +24511,7 @@
         <w:t xml:space="preserve">Output Integration</w:t>
       </w:r>
     </w:p>
-    <w:bookmarkStart w:id="375" w:name="cross-skill-integration-21"/>
+    <w:bookmarkStart w:id="376" w:name="cross-skill-integration-21"/>
     <w:p>
       <w:pPr>
         <w:pStyle w:val="Heading4"/>
@@ -23389,9 +24589,9 @@
         </w:pict>
       </w:r>
     </w:p>
-    <w:bookmarkEnd w:id="375"/>
     <w:bookmarkEnd w:id="376"/>
-    <w:bookmarkStart w:id="377" w:name="output-quality-self-check-21"/>
+    <w:bookmarkEnd w:id="377"/>
+    <w:bookmarkStart w:id="378" w:name="output-quality-self-check-21"/>
     <w:p>
       <w:pPr>
         <w:pStyle w:val="Heading3"/>
@@ -23602,8 +24802,8 @@
         </w:pict>
       </w:r>
     </w:p>
-    <w:bookmarkEnd w:id="377"/>
-    <w:bookmarkStart w:id="378" w:name="related-skills-21"/>
+    <w:bookmarkEnd w:id="378"/>
+    <w:bookmarkStart w:id="379" w:name="related-skills-21"/>
     <w:p>
       <w:pPr>
         <w:pStyle w:val="Heading3"/>
@@ -23675,9 +24875,9 @@
         <w:t xml:space="preserve">- Challenge</w:t>
       </w:r>
     </w:p>
-    <w:bookmarkEnd w:id="378"/>
     <w:bookmarkEnd w:id="379"/>
     <w:bookmarkEnd w:id="380"/>
+    <w:bookmarkEnd w:id="381"/>
     <w:sectPr/>
   </w:body>
 </w:document>

</xml_diff>